<commit_message>
Algebra: aggiunti capitoli 7-9 (lezione 3)
</commit_message>
<xml_diff>
--- a/Algebra lineare/Riassunto Algebra lineare.docx
+++ b/Algebra lineare/Riassunto Algebra lineare.docx
@@ -3037,6 +3037,2969 @@
       </w:r>
       <w:r>
         <w:t>.</w:t>
+      </w:r>
+    </w:p>
+    <w:p>
+      <w:r>
+        <w:rPr>
+          <w:b/>
+          <w:color w:val="EE0000"/>
+        </w:rPr>
+        <w:t>7. Coordinate Polari e Forma Esponenziale dei Numeri Complessi</w:t>
+      </w:r>
+    </w:p>
+    <w:p>
+      <w:r>
+        <w:rPr>
+          <w:b/>
+          <w:color w:val="E97132"/>
+        </w:rPr>
+        <w:t>Dalle coordinate cartesiane alle coordinate polari</w:t>
+      </w:r>
+    </w:p>
+    <w:p>
+      <w:r>
+        <w:rPr/>
+        <w:t xml:space="preserve">Nel capitolo precedente abbiamo identificato ogni numero complesso z = a + bi con il punto P = (a, b) del piano di Argand-Gauss. Per un punto diverso dall'origine O esiste però un secondo modo, del tutto equivalente, di indicarne la posizione: invece di dire "di quanto ci si sposta in orizzontale e in verticale", si dice </w:t>
+      </w:r>
+      <w:r>
+        <w:rPr>
+          <w:b/>
+        </w:rPr>
+        <w:t>a che distanza dall'origine</w:t>
+      </w:r>
+      <w:r>
+        <w:rPr/>
+        <w:t xml:space="preserve"> si trova il punto e </w:t>
+      </w:r>
+      <w:r>
+        <w:rPr>
+          <w:b/>
+        </w:rPr>
+        <w:t>in quale direzione</w:t>
+      </w:r>
+      <w:r>
+        <w:rPr/>
+        <w:t xml:space="preserve">. Si ottengono così le </w:t>
+      </w:r>
+      <w:r>
+        <w:rPr>
+          <w:b/>
+        </w:rPr>
+        <w:t>coordinate polari</w:t>
+      </w:r>
+      <w:r>
+        <w:rPr/>
+        <w:t xml:space="preserve"> (r, θ), definite da:</w:t>
+      </w:r>
+    </w:p>
+    <w:p>
+      <w:pPr>
+        <w:numPr>
+          <w:ilvl w:val="0"/>
+          <w:numId w:val="1"/>
+        </w:numPr>
+      </w:pPr>
+      <w:r>
+        <w:rPr/>
+        <w:t>r è la lunghezza del segmento OP, cioè la distanza di P dall'origine O;</w:t>
+      </w:r>
+    </w:p>
+    <w:p>
+      <w:pPr>
+        <w:numPr>
+          <w:ilvl w:val="0"/>
+          <w:numId w:val="1"/>
+        </w:numPr>
+      </w:pPr>
+      <w:r>
+        <w:rPr/>
+        <w:t xml:space="preserve">θ (la lettera greca </w:t>
+      </w:r>
+      <w:r>
+        <w:rPr>
+          <w:i/>
+        </w:rPr>
+        <w:t>theta</w:t>
+      </w:r>
+      <w:r>
+        <w:rPr/>
+        <w:t>) è l'angolo, misurato in radianti, che il segmento OP forma con il semiasse positivo delle ascisse, contando le rotazioni in senso antiorario.</w:t>
+      </w:r>
+    </w:p>
+    <w:p>
+      <w:r>
+        <w:rPr/>
+        <w:t>Il legame con le coordinate cartesiane passa per le funzioni seno e coseno, che si interpretano sulla circonferenza di raggio 1: se un punto sulla circonferenza forma un angolo θ con il semiasse positivo delle x, il suo coseno è l'ascissa e il suo seno è l'ordinata. Un punto a distanza r dall'origine ha quindi coordinate r volte più grandi:</w:t>
+      </w:r>
+    </w:p>
+    <w:p>
+      <w:pPr>
+        <w:numPr>
+          <w:ilvl w:val="0"/>
+          <w:numId w:val="1"/>
+        </w:numPr>
+      </w:pPr>
+      <w:r>
+        <w:rPr/>
+        <w:t>dalle polari alle cartesiane: a = r cos θ, b = r sen θ;</w:t>
+      </w:r>
+    </w:p>
+    <w:p>
+      <w:pPr>
+        <w:numPr>
+          <w:ilvl w:val="0"/>
+          <w:numId w:val="1"/>
+        </w:numPr>
+      </w:pPr>
+      <w:r>
+        <w:rPr/>
+        <w:t>dalle cartesiane alle polari: r = √(a</w:t>
+      </w:r>
+      <w:r>
+        <w:rPr>
+          <w:vertAlign w:val="superscript"/>
+        </w:rPr>
+        <w:t>2</w:t>
+      </w:r>
+      <w:r>
+        <w:rPr/>
+        <w:t xml:space="preserve"> + b</w:t>
+      </w:r>
+      <w:r>
+        <w:rPr>
+          <w:vertAlign w:val="superscript"/>
+        </w:rPr>
+        <w:t>2</w:t>
+      </w:r>
+      <w:r>
+        <w:rPr/>
+        <w:t>), cos θ = a / r, sen θ = b / r.</w:t>
+      </w:r>
+    </w:p>
+    <w:p>
+      <w:r>
+        <w:rPr>
+          <w:b/>
+          <w:color w:val="E97132"/>
+        </w:rPr>
+        <w:t>Modulo e argomento</w:t>
+      </w:r>
+    </w:p>
+    <w:p>
+      <w:r>
+        <w:rPr/>
+        <w:t>Applicando queste formule a un numero complesso z = a + bi ≠ 0 lo si può scrivere in coordinate polari come:</w:t>
+      </w:r>
+    </w:p>
+    <w:p>
+      <w:r>
+        <w:rPr/>
+        <w:t>z = r (cos θ + i sen θ)</w:t>
+      </w:r>
+    </w:p>
+    <w:p>
+      <w:r>
+        <w:rPr/>
+        <w:t xml:space="preserve">Il numero r = |z| è il </w:t>
+      </w:r>
+      <w:r>
+        <w:rPr>
+          <w:b/>
+        </w:rPr>
+        <w:t>modulo</w:t>
+      </w:r>
+      <w:r>
+        <w:rPr/>
+        <w:t xml:space="preserve"> di z, già incontrato come distanza dall'origine (e per z = 0 vale |z| = 0). L'angolo θ si chiama </w:t>
+      </w:r>
+      <w:r>
+        <w:rPr>
+          <w:b/>
+        </w:rPr>
+        <w:t>argomento</w:t>
+      </w:r>
+      <w:r>
+        <w:rPr/>
+        <w:t xml:space="preserve"> (o </w:t>
+      </w:r>
+      <w:r>
+        <w:rPr>
+          <w:i/>
+        </w:rPr>
+        <w:t>fase</w:t>
+      </w:r>
+      <w:r>
+        <w:rPr/>
+        <w:t>) di z e si indica con Arg(z). Due precisazioni importanti:</w:t>
+      </w:r>
+    </w:p>
+    <w:p>
+      <w:pPr>
+        <w:numPr>
+          <w:ilvl w:val="0"/>
+          <w:numId w:val="1"/>
+        </w:numPr>
+      </w:pPr>
+      <w:r>
+        <w:rPr/>
+        <w:t xml:space="preserve">l'argomento </w:t>
+      </w:r>
+      <w:r>
+        <w:rPr>
+          <w:b/>
+        </w:rPr>
+        <w:t>non è unico</w:t>
+      </w:r>
+      <w:r>
+        <w:rPr/>
+        <w:t>: aggiungendo o togliendo un giro completo si torna nello stesso punto, quindi θ è definito a meno di multipli di 2π. Per fissare una scelta si prende di solito θ ∈ [0, 2π), oppure θ ∈ (−π, π]: l'importante è dichiarare quale convenzione si usa;</w:t>
+      </w:r>
+    </w:p>
+    <w:p>
+      <w:pPr>
+        <w:numPr>
+          <w:ilvl w:val="0"/>
+          <w:numId w:val="1"/>
+        </w:numPr>
+      </w:pPr>
+      <w:r>
+        <w:rPr/>
+        <w:t xml:space="preserve">per z = 0 l'argomento </w:t>
+      </w:r>
+      <w:r>
+        <w:rPr>
+          <w:b/>
+        </w:rPr>
+        <w:t>non è definito</w:t>
+      </w:r>
+      <w:r>
+        <w:rPr/>
+        <w:t>, perché l'origine non ha una direzione: ogni angolo va bene.</w:t>
+      </w:r>
+    </w:p>
+    <w:p>
+      <w:r>
+        <w:rPr>
+          <w:b/>
+        </w:rPr>
+        <w:t>Trabocchetto d'Esame: ricavare θ da a e b.</w:t>
+      </w:r>
+      <w:r>
+        <w:rPr/>
+        <w:t xml:space="preserve"> Non basta calcolare arctan(b/a). Questa funzione restituisce solo angoli tra −π/2 e π/2, quindi bisogna distinguere i casi (qui con la convenzione θ ∈ [0, 2π)):</w:t>
+      </w:r>
+    </w:p>
+    <w:p>
+      <w:pPr>
+        <w:numPr>
+          <w:ilvl w:val="0"/>
+          <w:numId w:val="1"/>
+        </w:numPr>
+      </w:pPr>
+      <w:r>
+        <w:rPr/>
+        <w:t>se a &gt; 0 e b ≥ 0 (primo quadrante e semiasse reale positivo): θ = arctan(b/a);</w:t>
+      </w:r>
+    </w:p>
+    <w:p>
+      <w:pPr>
+        <w:numPr>
+          <w:ilvl w:val="0"/>
+          <w:numId w:val="1"/>
+        </w:numPr>
+      </w:pPr>
+      <w:r>
+        <w:rPr/>
+        <w:t>se a &gt; 0 e b &lt; 0 (quarto quadrante): θ = arctan(b/a) + 2π, perché arctan(b/a) è negativo;</w:t>
+      </w:r>
+    </w:p>
+    <w:p>
+      <w:pPr>
+        <w:numPr>
+          <w:ilvl w:val="0"/>
+          <w:numId w:val="1"/>
+        </w:numPr>
+      </w:pPr>
+      <w:r>
+        <w:rPr/>
+        <w:t>se a &lt; 0 (secondo e terzo quadrante): θ = arctan(b/a) + π;</w:t>
+      </w:r>
+    </w:p>
+    <w:p>
+      <w:pPr>
+        <w:numPr>
+          <w:ilvl w:val="0"/>
+          <w:numId w:val="1"/>
+        </w:numPr>
+      </w:pPr>
+      <w:r>
+        <w:rPr/>
+        <w:t>se a = 0 il rapporto b/a non esiste: θ = π/2 per b &gt; 0 e θ = 3π/2 per b &lt; 0.</w:t>
+      </w:r>
+    </w:p>
+    <w:p>
+      <w:r>
+        <w:rPr/>
+        <w:t>In caso di dubbio conviene sempre controllare con un disegno in quale quadrante si trova il punto. Per esempio, per z = −1 + i si ha r = √2 e arctan(1/(−1)) = −π/4; poiché a &lt; 0 si aggiunge π e si ottiene θ = 3π/4, coerente con il fatto che il punto sta nel secondo quadrante.</w:t>
+      </w:r>
+    </w:p>
+    <w:p>
+      <w:r>
+        <w:rPr>
+          <w:b/>
+          <w:color w:val="E97132"/>
+        </w:rPr>
+        <w:t>La notazione esponenziale</w:t>
+      </w:r>
+    </w:p>
+    <w:p>
+      <w:r>
+        <w:rPr/>
+        <w:t>La scrittura in coordinate polari si può rendere molto più compatta introducendo la notazione:</w:t>
+      </w:r>
+    </w:p>
+    <w:p>
+      <w:r>
+        <w:rPr/>
+        <w:t>e</w:t>
+      </w:r>
+      <w:r>
+        <w:rPr>
+          <w:vertAlign w:val="superscript"/>
+        </w:rPr>
+        <w:t>iθ</w:t>
+      </w:r>
+      <w:r>
+        <w:rPr/>
+        <w:t xml:space="preserve"> = cos θ + i sen θ</w:t>
+      </w:r>
+    </w:p>
+    <w:p>
+      <w:r>
+        <w:rPr/>
+        <w:t>Con questa scelta ogni numero complesso z ≠ 0 diventa:</w:t>
+      </w:r>
+    </w:p>
+    <w:p>
+      <w:r>
+        <w:rPr/>
+        <w:t>z = r e</w:t>
+      </w:r>
+      <w:r>
+        <w:rPr>
+          <w:vertAlign w:val="superscript"/>
+        </w:rPr>
+        <w:t>iθ</w:t>
+      </w:r>
+    </w:p>
+    <w:p>
+      <w:r>
+        <w:rPr/>
+        <w:t xml:space="preserve">che si chiama </w:t>
+      </w:r>
+      <w:r>
+        <w:rPr>
+          <w:b/>
+        </w:rPr>
+        <w:t>rappresentazione polare</w:t>
+      </w:r>
+      <w:r>
+        <w:rPr/>
+        <w:t xml:space="preserve"> (o </w:t>
+      </w:r>
+      <w:r>
+        <w:rPr>
+          <w:i/>
+        </w:rPr>
+        <w:t>esponenziale</w:t>
+      </w:r>
+      <w:r>
+        <w:rPr/>
+        <w:t>) di z. Il motivo profondo per cui compare proprio il numero e riguarda lo sviluppo in serie di potenze delle funzioni e</w:t>
+      </w:r>
+      <w:r>
+        <w:rPr>
+          <w:vertAlign w:val="superscript"/>
+        </w:rPr>
+        <w:t>x</w:t>
+      </w:r>
+      <w:r>
+        <w:rPr/>
+        <w:t>, sen x e cos x, e va oltre gli obiettivi del corso: per il momento basta considerare e</w:t>
+      </w:r>
+      <w:r>
+        <w:rPr>
+          <w:vertAlign w:val="superscript"/>
+        </w:rPr>
+        <w:t>iθ</w:t>
+      </w:r>
+      <w:r>
+        <w:rPr/>
+        <w:t xml:space="preserve"> come un simbolo che </w:t>
+      </w:r>
+      <w:r>
+        <w:rPr>
+          <w:i/>
+        </w:rPr>
+        <w:t>significa</w:t>
+      </w:r>
+      <w:r>
+        <w:rPr/>
+        <w:t xml:space="preserve"> cos θ + i sen θ. È un simbolo ben scelto, perché si comporta come un vero esponenziale (lo dimostriamo nel prossimo capitolo).</w:t>
+      </w:r>
+    </w:p>
+    <w:p>
+      <w:r>
+        <w:rPr/>
+        <w:t>I numeri e</w:t>
+      </w:r>
+      <w:r>
+        <w:rPr>
+          <w:vertAlign w:val="superscript"/>
+        </w:rPr>
+        <w:t>iθ</w:t>
+      </w:r>
+      <w:r>
+        <w:rPr/>
+        <w:t xml:space="preserve">, al variare di θ, sono esattamente i punti della </w:t>
+      </w:r>
+      <w:r>
+        <w:rPr>
+          <w:b/>
+        </w:rPr>
+        <w:t>circonferenza unitaria</w:t>
+      </w:r>
+      <w:r>
+        <w:rPr/>
+        <w:t>, cioè quelli con modulo 1. Due valori particolari sono molto noti:</w:t>
+      </w:r>
+    </w:p>
+    <w:p>
+      <w:pPr>
+        <w:numPr>
+          <w:ilvl w:val="0"/>
+          <w:numId w:val="1"/>
+        </w:numPr>
+      </w:pPr>
+      <w:r>
+        <w:rPr/>
+        <w:t>per θ = π si ottiene e</w:t>
+      </w:r>
+      <w:r>
+        <w:rPr>
+          <w:vertAlign w:val="superscript"/>
+        </w:rPr>
+        <w:t>iπ</w:t>
+      </w:r>
+      <w:r>
+        <w:rPr/>
+        <w:t xml:space="preserve"> = cos π + i sen π = −1, da cui la celebre </w:t>
+      </w:r>
+      <w:r>
+        <w:rPr>
+          <w:b/>
+        </w:rPr>
+        <w:t>identità di Eulero</w:t>
+      </w:r>
+      <w:r>
+        <w:rPr/>
+        <w:t xml:space="preserve"> e</w:t>
+      </w:r>
+      <w:r>
+        <w:rPr>
+          <w:vertAlign w:val="superscript"/>
+        </w:rPr>
+        <w:t>iπ</w:t>
+      </w:r>
+      <w:r>
+        <w:rPr/>
+        <w:t xml:space="preserve"> + 1 = 0;</w:t>
+      </w:r>
+    </w:p>
+    <w:p>
+      <w:pPr>
+        <w:numPr>
+          <w:ilvl w:val="0"/>
+          <w:numId w:val="1"/>
+        </w:numPr>
+      </w:pPr>
+      <w:r>
+        <w:rPr/>
+        <w:t>per θ = 2π si ottiene e</w:t>
+      </w:r>
+      <w:r>
+        <w:rPr>
+          <w:vertAlign w:val="superscript"/>
+        </w:rPr>
+        <w:t>2πi</w:t>
+      </w:r>
+      <w:r>
+        <w:rPr/>
+        <w:t xml:space="preserve"> = 1: dopo un giro completo si torna al punto di partenza.</w:t>
+      </w:r>
+    </w:p>
+    <w:p>
+      <w:r>
+        <w:rPr>
+          <w:b/>
+          <w:color w:val="E97132"/>
+        </w:rPr>
+        <w:t>Due esempi</w:t>
+      </w:r>
+    </w:p>
+    <w:p>
+      <w:r>
+        <w:rPr>
+          <w:b/>
+        </w:rPr>
+        <w:t>Dalla forma cartesiana a quella polare.</w:t>
+      </w:r>
+      <w:r>
+        <w:rPr/>
+        <w:t xml:space="preserve"> Vogliamo scrivere z = −5 in forma polare. Il punto sta sul semiasse reale negativo, a distanza 5 dall'origine, quindi r = 5, e l'angolo formato con il semiasse positivo è mezzo giro, θ = π. Dunque −5 = 5 e</w:t>
+      </w:r>
+      <w:r>
+        <w:rPr>
+          <w:vertAlign w:val="superscript"/>
+        </w:rPr>
+        <w:t>iπ</w:t>
+      </w:r>
+      <w:r>
+        <w:rPr/>
+        <w:t>.</w:t>
+      </w:r>
+    </w:p>
+    <w:p>
+      <w:r>
+        <w:rPr>
+          <w:b/>
+        </w:rPr>
+        <w:t>Dalla forma polare a quella cartesiana.</w:t>
+      </w:r>
+      <w:r>
+        <w:rPr/>
+        <w:t xml:space="preserve"> Dato z = 2 e</w:t>
+      </w:r>
+      <w:r>
+        <w:rPr>
+          <w:vertAlign w:val="superscript"/>
+        </w:rPr>
+        <w:t>iπ/4</w:t>
+      </w:r>
+      <w:r>
+        <w:rPr/>
+        <w:t>, si ha:</w:t>
+      </w:r>
+    </w:p>
+    <w:p>
+      <w:r>
+        <w:rPr/>
+        <w:t>z = 2 (cos(π/4) + i sen(π/4)) = 2 (√2/2 + i √2/2) = √2 + i √2</w:t>
+      </w:r>
+    </w:p>
+    <w:p>
+      <w:r>
+        <w:rPr>
+          <w:b/>
+          <w:color w:val="E97132"/>
+        </w:rPr>
+        <w:t>Quando due forme polari rappresentano lo stesso numero</w:t>
+      </w:r>
+    </w:p>
+    <w:p>
+      <w:r>
+        <w:rPr/>
+        <w:t>Poiché l'argomento è definito solo a meno di giri completi, due scritture r</w:t>
+      </w:r>
+      <w:r>
+        <w:rPr>
+          <w:vertAlign w:val="subscript"/>
+        </w:rPr>
+        <w:t>1</w:t>
+      </w:r>
+      <w:r>
+        <w:rPr/>
+        <w:t xml:space="preserve"> e</w:t>
+      </w:r>
+      <w:r>
+        <w:rPr>
+          <w:vertAlign w:val="superscript"/>
+        </w:rPr>
+        <w:t>iθ_{1</w:t>
+      </w:r>
+      <w:r>
+        <w:rPr/>
+        <w:t>} e r</w:t>
+      </w:r>
+      <w:r>
+        <w:rPr>
+          <w:vertAlign w:val="subscript"/>
+        </w:rPr>
+        <w:t>2</w:t>
+      </w:r>
+      <w:r>
+        <w:rPr/>
+        <w:t xml:space="preserve"> e</w:t>
+      </w:r>
+      <w:r>
+        <w:rPr>
+          <w:vertAlign w:val="superscript"/>
+        </w:rPr>
+        <w:t>iθ_{2</w:t>
+      </w:r>
+      <w:r>
+        <w:rPr/>
+        <w:t>} rappresentano lo stesso numero complesso se e solo se valgono entrambe le condizioni:</w:t>
+      </w:r>
+    </w:p>
+    <w:p>
+      <w:pPr>
+        <w:numPr>
+          <w:ilvl w:val="0"/>
+          <w:numId w:val="1"/>
+        </w:numPr>
+      </w:pPr>
+      <w:r>
+        <w:rPr/>
+        <w:t>r</w:t>
+      </w:r>
+      <w:r>
+        <w:rPr>
+          <w:vertAlign w:val="subscript"/>
+        </w:rPr>
+        <w:t>1</w:t>
+      </w:r>
+      <w:r>
+        <w:rPr/>
+        <w:t xml:space="preserve"> = r</w:t>
+      </w:r>
+      <w:r>
+        <w:rPr>
+          <w:vertAlign w:val="subscript"/>
+        </w:rPr>
+        <w:t>2</w:t>
+      </w:r>
+      <w:r>
+        <w:rPr/>
+        <w:t>, cioè hanno lo stesso modulo;</w:t>
+      </w:r>
+    </w:p>
+    <w:p>
+      <w:pPr>
+        <w:numPr>
+          <w:ilvl w:val="0"/>
+          <w:numId w:val="1"/>
+        </w:numPr>
+      </w:pPr>
+      <w:r>
+        <w:rPr/>
+        <w:t>θ</w:t>
+      </w:r>
+      <w:r>
+        <w:rPr>
+          <w:vertAlign w:val="subscript"/>
+        </w:rPr>
+        <w:t>2</w:t>
+      </w:r>
+      <w:r>
+        <w:rPr/>
+        <w:t xml:space="preserve"> = θ</w:t>
+      </w:r>
+      <w:r>
+        <w:rPr>
+          <w:vertAlign w:val="subscript"/>
+        </w:rPr>
+        <w:t>1</w:t>
+      </w:r>
+      <w:r>
+        <w:rPr/>
+        <w:t xml:space="preserve"> + 2kπ per qualche k ∈ ℤ, cioè gli angoli differiscono per un multiplo di 2π.</w:t>
+      </w:r>
+    </w:p>
+    <w:p>
+      <w:r>
+        <w:rPr/>
+        <w:t>È un dettaglio facile da trascurare, ma sarà indispensabile quando risolveremo le equazioni con le radici n-esime: due coppie (r, θ) diverse possono indicare lo stesso punto, e l'equazione va trattata tenendo conto di tutte. Nel prossimo capitolo vedremo però il vantaggio principale della rappresentazione polare: rende molto semplice il prodotto di due numeri complessi.</w:t>
+      </w:r>
+    </w:p>
+    <w:p>
+      <w:r>
+        <w:rPr>
+          <w:b/>
+          <w:color w:val="EE0000"/>
+        </w:rPr>
+        <w:t>8. Prodotto, Inverso e Coniugio in Forma Polare</w:t>
+      </w:r>
+    </w:p>
+    <w:p>
+      <w:r>
+        <w:rPr>
+          <w:b/>
+          <w:color w:val="E97132"/>
+        </w:rPr>
+        <w:t>L'esponenziale complesso si comporta come un esponenziale</w:t>
+      </w:r>
+    </w:p>
+    <w:p>
+      <w:r>
+        <w:rPr/>
+        <w:t>Alla fine del capitolo 6 avevamo osservato che il prodotto in coordinate cartesiane, (a, b) · (c, d) = (ac − bd, ad + bc), produce un risultato il cui legame geometrico con i due fattori resta oscuro. Con la rappresentazione polare il quadro cambia completamente. Il punto di partenza è la proprietà che giustifica la scelta della notazione e</w:t>
+      </w:r>
+      <w:r>
+        <w:rPr>
+          <w:vertAlign w:val="superscript"/>
+        </w:rPr>
+        <w:t>iθ</w:t>
+      </w:r>
+      <w:r>
+        <w:rPr/>
+        <w:t>.</w:t>
+      </w:r>
+    </w:p>
+    <w:p>
+      <w:r>
+        <w:rPr>
+          <w:b/>
+        </w:rPr>
+        <w:t>Proposizione.</w:t>
+      </w:r>
+      <w:r>
+        <w:rPr/>
+        <w:t xml:space="preserve"> Per ogni coppia di angoli θ</w:t>
+      </w:r>
+      <w:r>
+        <w:rPr>
+          <w:vertAlign w:val="subscript"/>
+        </w:rPr>
+        <w:t>1</w:t>
+      </w:r>
+      <w:r>
+        <w:rPr/>
+        <w:t xml:space="preserve"> e θ</w:t>
+      </w:r>
+      <w:r>
+        <w:rPr>
+          <w:vertAlign w:val="subscript"/>
+        </w:rPr>
+        <w:t>2</w:t>
+      </w:r>
+      <w:r>
+        <w:rPr/>
+        <w:t xml:space="preserve"> vale e</w:t>
+      </w:r>
+      <w:r>
+        <w:rPr>
+          <w:vertAlign w:val="superscript"/>
+        </w:rPr>
+        <w:t>i(θ_{1</w:t>
+      </w:r>
+      <w:r>
+        <w:rPr/>
+        <w:t xml:space="preserve"> + θ</w:t>
+      </w:r>
+      <w:r>
+        <w:rPr>
+          <w:vertAlign w:val="subscript"/>
+        </w:rPr>
+        <w:t>2</w:t>
+      </w:r>
+      <w:r>
+        <w:rPr/>
+        <w:t>)} = e</w:t>
+      </w:r>
+      <w:r>
+        <w:rPr>
+          <w:vertAlign w:val="superscript"/>
+        </w:rPr>
+        <w:t>iθ_{1</w:t>
+      </w:r>
+      <w:r>
+        <w:rPr/>
+        <w:t>} · e</w:t>
+      </w:r>
+      <w:r>
+        <w:rPr>
+          <w:vertAlign w:val="superscript"/>
+        </w:rPr>
+        <w:t>iθ_{2</w:t>
+      </w:r>
+      <w:r>
+        <w:rPr/>
+        <w:t>}.</w:t>
+      </w:r>
+    </w:p>
+    <w:p>
+      <w:r>
+        <w:rPr>
+          <w:i/>
+        </w:rPr>
+        <w:t>Dimostrazione.</w:t>
+      </w:r>
+      <w:r>
+        <w:rPr/>
+        <w:t xml:space="preserve"> Si sviluppa il prodotto applicando la definizione di e</w:t>
+      </w:r>
+      <w:r>
+        <w:rPr>
+          <w:vertAlign w:val="superscript"/>
+        </w:rPr>
+        <w:t>iθ</w:t>
+      </w:r>
+      <w:r>
+        <w:rPr/>
+        <w:t xml:space="preserve"> e la proprietà distributiva, ricordando che i</w:t>
+      </w:r>
+      <w:r>
+        <w:rPr>
+          <w:vertAlign w:val="superscript"/>
+        </w:rPr>
+        <w:t>2</w:t>
+      </w:r>
+      <w:r>
+        <w:rPr/>
+        <w:t xml:space="preserve"> = −1:</w:t>
+      </w:r>
+    </w:p>
+    <w:p>
+      <w:r>
+        <w:rPr/>
+        <w:t>1. e</w:t>
+      </w:r>
+      <w:r>
+        <w:rPr>
+          <w:vertAlign w:val="superscript"/>
+        </w:rPr>
+        <w:t>iθ_{1</w:t>
+      </w:r>
+      <w:r>
+        <w:rPr/>
+        <w:t>} · e</w:t>
+      </w:r>
+      <w:r>
+        <w:rPr>
+          <w:vertAlign w:val="superscript"/>
+        </w:rPr>
+        <w:t>iθ_{2</w:t>
+      </w:r>
+      <w:r>
+        <w:rPr/>
+        <w:t>} = (cos θ</w:t>
+      </w:r>
+      <w:r>
+        <w:rPr>
+          <w:vertAlign w:val="subscript"/>
+        </w:rPr>
+        <w:t>1</w:t>
+      </w:r>
+      <w:r>
+        <w:rPr/>
+        <w:t xml:space="preserve"> + i sen θ</w:t>
+      </w:r>
+      <w:r>
+        <w:rPr>
+          <w:vertAlign w:val="subscript"/>
+        </w:rPr>
+        <w:t>1</w:t>
+      </w:r>
+      <w:r>
+        <w:rPr/>
+        <w:t>) (cos θ</w:t>
+      </w:r>
+      <w:r>
+        <w:rPr>
+          <w:vertAlign w:val="subscript"/>
+        </w:rPr>
+        <w:t>2</w:t>
+      </w:r>
+      <w:r>
+        <w:rPr/>
+        <w:t xml:space="preserve"> + i sen θ</w:t>
+      </w:r>
+      <w:r>
+        <w:rPr>
+          <w:vertAlign w:val="subscript"/>
+        </w:rPr>
+        <w:t>2</w:t>
+      </w:r>
+      <w:r>
+        <w:rPr/>
+        <w:t>), per definizione di e</w:t>
+      </w:r>
+      <w:r>
+        <w:rPr>
+          <w:vertAlign w:val="superscript"/>
+        </w:rPr>
+        <w:t>iθ</w:t>
+      </w:r>
+      <w:r>
+        <w:rPr/>
+        <w:t>;</w:t>
+      </w:r>
+    </w:p>
+    <w:p>
+      <w:r>
+        <w:rPr/>
+        <w:t>2. = (cos θ</w:t>
+      </w:r>
+      <w:r>
+        <w:rPr>
+          <w:vertAlign w:val="subscript"/>
+        </w:rPr>
+        <w:t>1</w:t>
+      </w:r>
+      <w:r>
+        <w:rPr/>
+        <w:t xml:space="preserve"> cos θ</w:t>
+      </w:r>
+      <w:r>
+        <w:rPr>
+          <w:vertAlign w:val="subscript"/>
+        </w:rPr>
+        <w:t>2</w:t>
+      </w:r>
+      <w:r>
+        <w:rPr/>
+        <w:t xml:space="preserve"> − sen θ</w:t>
+      </w:r>
+      <w:r>
+        <w:rPr>
+          <w:vertAlign w:val="subscript"/>
+        </w:rPr>
+        <w:t>1</w:t>
+      </w:r>
+      <w:r>
+        <w:rPr/>
+        <w:t xml:space="preserve"> sen θ</w:t>
+      </w:r>
+      <w:r>
+        <w:rPr>
+          <w:vertAlign w:val="subscript"/>
+        </w:rPr>
+        <w:t>2</w:t>
+      </w:r>
+      <w:r>
+        <w:rPr/>
+        <w:t>) + i (cos θ</w:t>
+      </w:r>
+      <w:r>
+        <w:rPr>
+          <w:vertAlign w:val="subscript"/>
+        </w:rPr>
+        <w:t>1</w:t>
+      </w:r>
+      <w:r>
+        <w:rPr/>
+        <w:t xml:space="preserve"> sen θ</w:t>
+      </w:r>
+      <w:r>
+        <w:rPr>
+          <w:vertAlign w:val="subscript"/>
+        </w:rPr>
+        <w:t>2</w:t>
+      </w:r>
+      <w:r>
+        <w:rPr/>
+        <w:t xml:space="preserve"> + sen θ</w:t>
+      </w:r>
+      <w:r>
+        <w:rPr>
+          <w:vertAlign w:val="subscript"/>
+        </w:rPr>
+        <w:t>1</w:t>
+      </w:r>
+      <w:r>
+        <w:rPr/>
+        <w:t xml:space="preserve"> cos θ</w:t>
+      </w:r>
+      <w:r>
+        <w:rPr>
+          <w:vertAlign w:val="subscript"/>
+        </w:rPr>
+        <w:t>2</w:t>
+      </w:r>
+      <w:r>
+        <w:rPr/>
+        <w:t>), sviluppando il prodotto e usando i</w:t>
+      </w:r>
+      <w:r>
+        <w:rPr>
+          <w:vertAlign w:val="superscript"/>
+        </w:rPr>
+        <w:t>2</w:t>
+      </w:r>
+      <w:r>
+        <w:rPr/>
+        <w:t xml:space="preserve"> = −1;</w:t>
+      </w:r>
+    </w:p>
+    <w:p>
+      <w:r>
+        <w:rPr/>
+        <w:t>3. = cos(θ</w:t>
+      </w:r>
+      <w:r>
+        <w:rPr>
+          <w:vertAlign w:val="subscript"/>
+        </w:rPr>
+        <w:t>1</w:t>
+      </w:r>
+      <w:r>
+        <w:rPr/>
+        <w:t xml:space="preserve"> + θ</w:t>
+      </w:r>
+      <w:r>
+        <w:rPr>
+          <w:vertAlign w:val="subscript"/>
+        </w:rPr>
+        <w:t>2</w:t>
+      </w:r>
+      <w:r>
+        <w:rPr/>
+        <w:t>) + i sen(θ</w:t>
+      </w:r>
+      <w:r>
+        <w:rPr>
+          <w:vertAlign w:val="subscript"/>
+        </w:rPr>
+        <w:t>1</w:t>
+      </w:r>
+      <w:r>
+        <w:rPr/>
+        <w:t xml:space="preserve"> + θ</w:t>
+      </w:r>
+      <w:r>
+        <w:rPr>
+          <w:vertAlign w:val="subscript"/>
+        </w:rPr>
+        <w:t>2</w:t>
+      </w:r>
+      <w:r>
+        <w:rPr/>
+        <w:t>), perché le due parentesi sono proprio le formule di addizione di coseno e seno;</w:t>
+      </w:r>
+    </w:p>
+    <w:p>
+      <w:r>
+        <w:rPr/>
+        <w:t>4. = e</w:t>
+      </w:r>
+      <w:r>
+        <w:rPr>
+          <w:vertAlign w:val="superscript"/>
+        </w:rPr>
+        <w:t>i(θ_{1</w:t>
+      </w:r>
+      <w:r>
+        <w:rPr/>
+        <w:t xml:space="preserve"> + θ</w:t>
+      </w:r>
+      <w:r>
+        <w:rPr>
+          <w:vertAlign w:val="subscript"/>
+        </w:rPr>
+        <w:t>2</w:t>
+      </w:r>
+      <w:r>
+        <w:rPr/>
+        <w:t>)}, di nuovo per definizione. ∎</w:t>
+      </w:r>
+    </w:p>
+    <w:p>
+      <w:r>
+        <w:rPr>
+          <w:b/>
+          <w:color w:val="E97132"/>
+        </w:rPr>
+        <w:t>Il prodotto: i moduli si moltiplicano, gli angoli si sommano</w:t>
+      </w:r>
+    </w:p>
+    <w:p>
+      <w:r>
+        <w:rPr/>
+        <w:t>Siano z</w:t>
+      </w:r>
+      <w:r>
+        <w:rPr>
+          <w:vertAlign w:val="subscript"/>
+        </w:rPr>
+        <w:t>1</w:t>
+      </w:r>
+      <w:r>
+        <w:rPr/>
+        <w:t xml:space="preserve"> = r</w:t>
+      </w:r>
+      <w:r>
+        <w:rPr>
+          <w:vertAlign w:val="subscript"/>
+        </w:rPr>
+        <w:t>1</w:t>
+      </w:r>
+      <w:r>
+        <w:rPr/>
+        <w:t xml:space="preserve"> e</w:t>
+      </w:r>
+      <w:r>
+        <w:rPr>
+          <w:vertAlign w:val="superscript"/>
+        </w:rPr>
+        <w:t>iθ_{1</w:t>
+      </w:r>
+      <w:r>
+        <w:rPr/>
+        <w:t>} e z</w:t>
+      </w:r>
+      <w:r>
+        <w:rPr>
+          <w:vertAlign w:val="subscript"/>
+        </w:rPr>
+        <w:t>2</w:t>
+      </w:r>
+      <w:r>
+        <w:rPr/>
+        <w:t xml:space="preserve"> = r</w:t>
+      </w:r>
+      <w:r>
+        <w:rPr>
+          <w:vertAlign w:val="subscript"/>
+        </w:rPr>
+        <w:t>2</w:t>
+      </w:r>
+      <w:r>
+        <w:rPr/>
+        <w:t xml:space="preserve"> e</w:t>
+      </w:r>
+      <w:r>
+        <w:rPr>
+          <w:vertAlign w:val="superscript"/>
+        </w:rPr>
+        <w:t>iθ_{2</w:t>
+      </w:r>
+      <w:r>
+        <w:rPr/>
+        <w:t>}. Grazie alla proposizione precedente il prodotto si calcola in una riga:</w:t>
+      </w:r>
+    </w:p>
+    <w:p>
+      <w:r>
+        <w:rPr/>
+        <w:t>z</w:t>
+      </w:r>
+      <w:r>
+        <w:rPr>
+          <w:vertAlign w:val="subscript"/>
+        </w:rPr>
+        <w:t>1</w:t>
+      </w:r>
+      <w:r>
+        <w:rPr/>
+        <w:t xml:space="preserve"> z</w:t>
+      </w:r>
+      <w:r>
+        <w:rPr>
+          <w:vertAlign w:val="subscript"/>
+        </w:rPr>
+        <w:t>2</w:t>
+      </w:r>
+      <w:r>
+        <w:rPr/>
+        <w:t xml:space="preserve"> = r</w:t>
+      </w:r>
+      <w:r>
+        <w:rPr>
+          <w:vertAlign w:val="subscript"/>
+        </w:rPr>
+        <w:t>1</w:t>
+      </w:r>
+      <w:r>
+        <w:rPr/>
+        <w:t xml:space="preserve"> e</w:t>
+      </w:r>
+      <w:r>
+        <w:rPr>
+          <w:vertAlign w:val="superscript"/>
+        </w:rPr>
+        <w:t>iθ_{1</w:t>
+      </w:r>
+      <w:r>
+        <w:rPr/>
+        <w:t>} · r</w:t>
+      </w:r>
+      <w:r>
+        <w:rPr>
+          <w:vertAlign w:val="subscript"/>
+        </w:rPr>
+        <w:t>2</w:t>
+      </w:r>
+      <w:r>
+        <w:rPr/>
+        <w:t xml:space="preserve"> e</w:t>
+      </w:r>
+      <w:r>
+        <w:rPr>
+          <w:vertAlign w:val="superscript"/>
+        </w:rPr>
+        <w:t>iθ_{2</w:t>
+      </w:r>
+      <w:r>
+        <w:rPr/>
+        <w:t>} = (r</w:t>
+      </w:r>
+      <w:r>
+        <w:rPr>
+          <w:vertAlign w:val="subscript"/>
+        </w:rPr>
+        <w:t>1</w:t>
+      </w:r>
+      <w:r>
+        <w:rPr/>
+        <w:t xml:space="preserve"> r</w:t>
+      </w:r>
+      <w:r>
+        <w:rPr>
+          <w:vertAlign w:val="subscript"/>
+        </w:rPr>
+        <w:t>2</w:t>
+      </w:r>
+      <w:r>
+        <w:rPr/>
+        <w:t>) e</w:t>
+      </w:r>
+      <w:r>
+        <w:rPr>
+          <w:vertAlign w:val="superscript"/>
+        </w:rPr>
+        <w:t>i(θ_{1</w:t>
+      </w:r>
+      <w:r>
+        <w:rPr/>
+        <w:t xml:space="preserve"> + θ</w:t>
+      </w:r>
+      <w:r>
+        <w:rPr>
+          <w:vertAlign w:val="subscript"/>
+        </w:rPr>
+        <w:t>2</w:t>
+      </w:r>
+      <w:r>
+        <w:rPr/>
+        <w:t>)}</w:t>
+      </w:r>
+    </w:p>
+    <w:p>
+      <w:r>
+        <w:rPr/>
+        <w:t>Leggendo modulo e argomento del risultato si ottengono due regole molto comode:</w:t>
+      </w:r>
+    </w:p>
+    <w:p>
+      <w:pPr>
+        <w:numPr>
+          <w:ilvl w:val="0"/>
+          <w:numId w:val="1"/>
+        </w:numPr>
+      </w:pPr>
+      <w:r>
+        <w:rPr/>
+        <w:t>|z</w:t>
+      </w:r>
+      <w:r>
+        <w:rPr>
+          <w:vertAlign w:val="subscript"/>
+        </w:rPr>
+        <w:t>1</w:t>
+      </w:r>
+      <w:r>
+        <w:rPr/>
+        <w:t xml:space="preserve"> z</w:t>
+      </w:r>
+      <w:r>
+        <w:rPr>
+          <w:vertAlign w:val="subscript"/>
+        </w:rPr>
+        <w:t>2</w:t>
+      </w:r>
+      <w:r>
+        <w:rPr/>
+        <w:t>| = r</w:t>
+      </w:r>
+      <w:r>
+        <w:rPr>
+          <w:vertAlign w:val="subscript"/>
+        </w:rPr>
+        <w:t>1</w:t>
+      </w:r>
+      <w:r>
+        <w:rPr/>
+        <w:t xml:space="preserve"> r</w:t>
+      </w:r>
+      <w:r>
+        <w:rPr>
+          <w:vertAlign w:val="subscript"/>
+        </w:rPr>
+        <w:t>2</w:t>
+      </w:r>
+      <w:r>
+        <w:rPr/>
+        <w:t xml:space="preserve"> = |z</w:t>
+      </w:r>
+      <w:r>
+        <w:rPr>
+          <w:vertAlign w:val="subscript"/>
+        </w:rPr>
+        <w:t>1</w:t>
+      </w:r>
+      <w:r>
+        <w:rPr/>
+        <w:t>| · |z</w:t>
+      </w:r>
+      <w:r>
+        <w:rPr>
+          <w:vertAlign w:val="subscript"/>
+        </w:rPr>
+        <w:t>2</w:t>
+      </w:r>
+      <w:r>
+        <w:rPr/>
+        <w:t>|, cioè il modulo del prodotto è il prodotto dei moduli;</w:t>
+      </w:r>
+    </w:p>
+    <w:p>
+      <w:pPr>
+        <w:numPr>
+          <w:ilvl w:val="0"/>
+          <w:numId w:val="1"/>
+        </w:numPr>
+      </w:pPr>
+      <w:r>
+        <w:rPr/>
+        <w:t>Arg(z</w:t>
+      </w:r>
+      <w:r>
+        <w:rPr>
+          <w:vertAlign w:val="subscript"/>
+        </w:rPr>
+        <w:t>1</w:t>
+      </w:r>
+      <w:r>
+        <w:rPr/>
+        <w:t xml:space="preserve"> z</w:t>
+      </w:r>
+      <w:r>
+        <w:rPr>
+          <w:vertAlign w:val="subscript"/>
+        </w:rPr>
+        <w:t>2</w:t>
+      </w:r>
+      <w:r>
+        <w:rPr/>
+        <w:t>) = θ</w:t>
+      </w:r>
+      <w:r>
+        <w:rPr>
+          <w:vertAlign w:val="subscript"/>
+        </w:rPr>
+        <w:t>1</w:t>
+      </w:r>
+      <w:r>
+        <w:rPr/>
+        <w:t xml:space="preserve"> + θ</w:t>
+      </w:r>
+      <w:r>
+        <w:rPr>
+          <w:vertAlign w:val="subscript"/>
+        </w:rPr>
+        <w:t>2</w:t>
+      </w:r>
+      <w:r>
+        <w:rPr/>
+        <w:t xml:space="preserve"> = Arg(z</w:t>
+      </w:r>
+      <w:r>
+        <w:rPr>
+          <w:vertAlign w:val="subscript"/>
+        </w:rPr>
+        <w:t>1</w:t>
+      </w:r>
+      <w:r>
+        <w:rPr/>
+        <w:t>) + Arg(z</w:t>
+      </w:r>
+      <w:r>
+        <w:rPr>
+          <w:vertAlign w:val="subscript"/>
+        </w:rPr>
+        <w:t>2</w:t>
+      </w:r>
+      <w:r>
+        <w:rPr/>
+        <w:t>), cioè l'argomento del prodotto è la somma degli argomenti (sempre a meno di multipli di 2π).</w:t>
+      </w:r>
+    </w:p>
+    <w:p>
+      <w:r>
+        <w:rPr>
+          <w:b/>
+        </w:rPr>
+        <w:t>Significato geometrico.</w:t>
+      </w:r>
+      <w:r>
+        <w:rPr/>
+        <w:t xml:space="preserve"> Moltiplicare z</w:t>
+      </w:r>
+      <w:r>
+        <w:rPr>
+          <w:vertAlign w:val="subscript"/>
+        </w:rPr>
+        <w:t>1</w:t>
+      </w:r>
+      <w:r>
+        <w:rPr/>
+        <w:t xml:space="preserve"> per z</w:t>
+      </w:r>
+      <w:r>
+        <w:rPr>
+          <w:vertAlign w:val="subscript"/>
+        </w:rPr>
+        <w:t>2</w:t>
+      </w:r>
+      <w:r>
+        <w:rPr/>
+        <w:t xml:space="preserve"> equivale a </w:t>
+      </w:r>
+      <w:r>
+        <w:rPr>
+          <w:b/>
+        </w:rPr>
+        <w:t>ruotare</w:t>
+      </w:r>
+      <w:r>
+        <w:rPr/>
+        <w:t xml:space="preserve"> z</w:t>
+      </w:r>
+      <w:r>
+        <w:rPr>
+          <w:vertAlign w:val="subscript"/>
+        </w:rPr>
+        <w:t>1</w:t>
+      </w:r>
+      <w:r>
+        <w:rPr/>
+        <w:t xml:space="preserve"> dell'angolo θ</w:t>
+      </w:r>
+      <w:r>
+        <w:rPr>
+          <w:vertAlign w:val="subscript"/>
+        </w:rPr>
+        <w:t>2</w:t>
+      </w:r>
+      <w:r>
+        <w:rPr/>
+        <w:t xml:space="preserve"> e a </w:t>
+      </w:r>
+      <w:r>
+        <w:rPr>
+          <w:b/>
+        </w:rPr>
+        <w:t>riscalarne</w:t>
+      </w:r>
+      <w:r>
+        <w:rPr/>
+        <w:t xml:space="preserve"> la lunghezza del fattore r</w:t>
+      </w:r>
+      <w:r>
+        <w:rPr>
+          <w:vertAlign w:val="subscript"/>
+        </w:rPr>
+        <w:t>2</w:t>
+      </w:r>
+      <w:r>
+        <w:rPr/>
+        <w:t>. È la spiegazione geometrica che cercavamo: la moltiplicazione complessa è una rotazione combinata con un ingrandimento (o una riduzione).</w:t>
+      </w:r>
+    </w:p>
+    <w:p>
+      <w:r>
+        <w:rPr>
+          <w:b/>
+        </w:rPr>
+        <w:t>Esempio.</w:t>
+      </w:r>
+      <w:r>
+        <w:rPr/>
+        <w:t xml:space="preserve"> Calcoliamo (1 + i) · (1 + i). Il numero 1 + i ha modulo √2 e argomento π/4, quindi 1 + i = √2 e</w:t>
+      </w:r>
+      <w:r>
+        <w:rPr>
+          <w:vertAlign w:val="superscript"/>
+        </w:rPr>
+        <w:t>iπ/4</w:t>
+      </w:r>
+      <w:r>
+        <w:rPr/>
+        <w:t>. Elevando al quadrato:</w:t>
+      </w:r>
+    </w:p>
+    <w:p>
+      <w:r>
+        <w:rPr/>
+        <w:t>(1 + i)</w:t>
+      </w:r>
+      <w:r>
+        <w:rPr>
+          <w:vertAlign w:val="superscript"/>
+        </w:rPr>
+        <w:t>2</w:t>
+      </w:r>
+      <w:r>
+        <w:rPr/>
+        <w:t xml:space="preserve"> = (√2)</w:t>
+      </w:r>
+      <w:r>
+        <w:rPr>
+          <w:vertAlign w:val="superscript"/>
+        </w:rPr>
+        <w:t>2</w:t>
+      </w:r>
+      <w:r>
+        <w:rPr/>
+        <w:t xml:space="preserve"> e</w:t>
+      </w:r>
+      <w:r>
+        <w:rPr>
+          <w:vertAlign w:val="superscript"/>
+        </w:rPr>
+        <w:t>iπ/2</w:t>
+      </w:r>
+      <w:r>
+        <w:rPr/>
+        <w:t xml:space="preserve"> = 2 e</w:t>
+      </w:r>
+      <w:r>
+        <w:rPr>
+          <w:vertAlign w:val="superscript"/>
+        </w:rPr>
+        <w:t>iπ/2</w:t>
+      </w:r>
+      <w:r>
+        <w:rPr/>
+        <w:t xml:space="preserve"> = 2i</w:t>
+      </w:r>
+    </w:p>
+    <w:p>
+      <w:r>
+        <w:rPr/>
+        <w:t>Si può controllare con le coordinate cartesiane: (1 + i)</w:t>
+      </w:r>
+      <w:r>
+        <w:rPr>
+          <w:vertAlign w:val="superscript"/>
+        </w:rPr>
+        <w:t>2</w:t>
+      </w:r>
+      <w:r>
+        <w:rPr/>
+        <w:t xml:space="preserve"> = 1 + 2i + i</w:t>
+      </w:r>
+      <w:r>
+        <w:rPr>
+          <w:vertAlign w:val="superscript"/>
+        </w:rPr>
+        <w:t>2</w:t>
+      </w:r>
+      <w:r>
+        <w:rPr/>
+        <w:t xml:space="preserve"> = 2i.</w:t>
+      </w:r>
+    </w:p>
+    <w:p>
+      <w:r>
+        <w:rPr>
+          <w:b/>
+          <w:color w:val="E97132"/>
+        </w:rPr>
+        <w:t>Coniugio e inverso</w:t>
+      </w:r>
+    </w:p>
+    <w:p>
+      <w:r>
+        <w:rPr/>
+        <w:t>Per scrivere il coniugato in forma polare partiamo da z = a + bi = r e</w:t>
+      </w:r>
+      <w:r>
+        <w:rPr>
+          <w:vertAlign w:val="superscript"/>
+        </w:rPr>
+        <w:t>iθ</w:t>
+      </w:r>
+      <w:r>
+        <w:rPr/>
+        <w:t>. Il coniugato z̄ = a − bi ha la stessa parte reale e parte immaginaria opposta: il punto viene riflesso rispetto all'asse reale, quindi mantiene il modulo e cambia segno all'angolo. Lo si verifica direttamente, perché cos(−θ) = cos θ e sen(−θ) = −sen θ:</w:t>
+      </w:r>
+    </w:p>
+    <w:p>
+      <w:r>
+        <w:rPr/>
+        <w:t>z̄ = r e</w:t>
+      </w:r>
+      <w:r>
+        <w:rPr>
+          <w:vertAlign w:val="superscript"/>
+        </w:rPr>
+        <w:t>−iθ</w:t>
+      </w:r>
+      <w:r>
+        <w:rPr/>
+        <w:t xml:space="preserve"> = r cos θ − i r sen θ = a − bi</w:t>
+      </w:r>
+    </w:p>
+    <w:p>
+      <w:r>
+        <w:rPr/>
+        <w:t>Nel capitolo 5 avevamo ricavato l'inverso di un numero z ≠ 0 come z</w:t>
+      </w:r>
+      <w:r>
+        <w:rPr>
+          <w:vertAlign w:val="superscript"/>
+        </w:rPr>
+        <w:t>-1</w:t>
+      </w:r>
+      <w:r>
+        <w:rPr/>
+        <w:t xml:space="preserve"> = z̄ / |z|</w:t>
+      </w:r>
+      <w:r>
+        <w:rPr>
+          <w:vertAlign w:val="superscript"/>
+        </w:rPr>
+        <w:t>2</w:t>
+      </w:r>
+      <w:r>
+        <w:rPr/>
+        <w:t>. In forma polare il calcolo è immediato:</w:t>
+      </w:r>
+    </w:p>
+    <w:p>
+      <w:r>
+        <w:rPr/>
+        <w:t>z</w:t>
+      </w:r>
+      <w:r>
+        <w:rPr>
+          <w:vertAlign w:val="superscript"/>
+        </w:rPr>
+        <w:t>-1</w:t>
+      </w:r>
+      <w:r>
+        <w:rPr/>
+        <w:t xml:space="preserve"> = z̄ / |z|</w:t>
+      </w:r>
+      <w:r>
+        <w:rPr>
+          <w:vertAlign w:val="superscript"/>
+        </w:rPr>
+        <w:t>2</w:t>
+      </w:r>
+      <w:r>
+        <w:rPr/>
+        <w:t xml:space="preserve"> = r e</w:t>
+      </w:r>
+      <w:r>
+        <w:rPr>
+          <w:vertAlign w:val="superscript"/>
+        </w:rPr>
+        <w:t>−iθ</w:t>
+      </w:r>
+      <w:r>
+        <w:rPr/>
+        <w:t xml:space="preserve"> / r</w:t>
+      </w:r>
+      <w:r>
+        <w:rPr>
+          <w:vertAlign w:val="superscript"/>
+        </w:rPr>
+        <w:t>2</w:t>
+      </w:r>
+      <w:r>
+        <w:rPr/>
+        <w:t xml:space="preserve"> = (1/r) e</w:t>
+      </w:r>
+      <w:r>
+        <w:rPr>
+          <w:vertAlign w:val="superscript"/>
+        </w:rPr>
+        <w:t>−iθ</w:t>
+      </w:r>
+    </w:p>
+    <w:p>
+      <w:r>
+        <w:rPr/>
+        <w:t xml:space="preserve">In parole: l'inverso ha </w:t>
+      </w:r>
+      <w:r>
+        <w:rPr>
+          <w:b/>
+        </w:rPr>
+        <w:t>modulo inverso</w:t>
+      </w:r>
+      <w:r>
+        <w:rPr/>
+        <w:t xml:space="preserve"> (1/r) e </w:t>
+      </w:r>
+      <w:r>
+        <w:rPr>
+          <w:b/>
+        </w:rPr>
+        <w:t>argomento opposto</w:t>
+      </w:r>
+      <w:r>
+        <w:rPr/>
+        <w:t xml:space="preserve"> (−θ). Come verifica, il prodotto z · z</w:t>
+      </w:r>
+      <w:r>
+        <w:rPr>
+          <w:vertAlign w:val="superscript"/>
+        </w:rPr>
+        <w:t>-1</w:t>
+      </w:r>
+      <w:r>
+        <w:rPr/>
+        <w:t xml:space="preserve"> = r · (1/r) · e</w:t>
+      </w:r>
+      <w:r>
+        <w:rPr>
+          <w:vertAlign w:val="superscript"/>
+        </w:rPr>
+        <w:t>i(θ − θ)</w:t>
+      </w:r>
+      <w:r>
+        <w:rPr/>
+        <w:t xml:space="preserve"> = e</w:t>
+      </w:r>
+      <w:r>
+        <w:rPr>
+          <w:vertAlign w:val="superscript"/>
+        </w:rPr>
+        <w:t>i·0</w:t>
+      </w:r>
+      <w:r>
+        <w:rPr/>
+        <w:t xml:space="preserve"> = cos 0 + i sen 0 = 1.</w:t>
+      </w:r>
+    </w:p>
+    <w:p>
+      <w:r>
+        <w:rPr/>
+        <w:t>Combinando prodotto e inverso si ottiene anche la regola per la divisione, valida per z</w:t>
+      </w:r>
+      <w:r>
+        <w:rPr>
+          <w:vertAlign w:val="subscript"/>
+        </w:rPr>
+        <w:t>2</w:t>
+      </w:r>
+      <w:r>
+        <w:rPr/>
+        <w:t xml:space="preserve"> ≠ 0: z</w:t>
+      </w:r>
+      <w:r>
+        <w:rPr>
+          <w:vertAlign w:val="subscript"/>
+        </w:rPr>
+        <w:t>1</w:t>
+      </w:r>
+      <w:r>
+        <w:rPr/>
+        <w:t xml:space="preserve"> / z</w:t>
+      </w:r>
+      <w:r>
+        <w:rPr>
+          <w:vertAlign w:val="subscript"/>
+        </w:rPr>
+        <w:t>2</w:t>
+      </w:r>
+      <w:r>
+        <w:rPr/>
+        <w:t xml:space="preserve"> = z</w:t>
+      </w:r>
+      <w:r>
+        <w:rPr>
+          <w:vertAlign w:val="subscript"/>
+        </w:rPr>
+        <w:t>1</w:t>
+      </w:r>
+      <w:r>
+        <w:rPr/>
+        <w:t xml:space="preserve"> · z</w:t>
+      </w:r>
+      <w:r>
+        <w:rPr>
+          <w:vertAlign w:val="subscript"/>
+        </w:rPr>
+        <w:t>2</w:t>
+      </w:r>
+      <w:r>
+        <w:rPr>
+          <w:vertAlign w:val="superscript"/>
+        </w:rPr>
+        <w:t>-1</w:t>
+      </w:r>
+      <w:r>
+        <w:rPr/>
+        <w:t xml:space="preserve"> = (r</w:t>
+      </w:r>
+      <w:r>
+        <w:rPr>
+          <w:vertAlign w:val="subscript"/>
+        </w:rPr>
+        <w:t>1</w:t>
+      </w:r>
+      <w:r>
+        <w:rPr/>
+        <w:t xml:space="preserve"> / r</w:t>
+      </w:r>
+      <w:r>
+        <w:rPr>
+          <w:vertAlign w:val="subscript"/>
+        </w:rPr>
+        <w:t>2</w:t>
+      </w:r>
+      <w:r>
+        <w:rPr/>
+        <w:t>) e</w:t>
+      </w:r>
+      <w:r>
+        <w:rPr>
+          <w:vertAlign w:val="superscript"/>
+        </w:rPr>
+        <w:t>i(θ_{1</w:t>
+      </w:r>
+      <w:r>
+        <w:rPr/>
+        <w:t xml:space="preserve"> − θ</w:t>
+      </w:r>
+      <w:r>
+        <w:rPr>
+          <w:vertAlign w:val="subscript"/>
+        </w:rPr>
+        <w:t>2</w:t>
+      </w:r>
+      <w:r>
+        <w:rPr/>
+        <w:t>)}, cioè si dividono i moduli e si sottraggono gli argomenti.</w:t>
+      </w:r>
+    </w:p>
+    <w:p>
+      <w:r>
+        <w:rPr/>
+        <w:t>Resta da vedere cosa succede quando lo stesso numero viene moltiplicato per se stesso più volte: è il tema del prossimo capitolo, che porterà alle potenze e alle radici n-esime.</w:t>
+      </w:r>
+    </w:p>
+    <w:p>
+      <w:r>
+        <w:rPr>
+          <w:b/>
+          <w:color w:val="EE0000"/>
+        </w:rPr>
+        <w:t>9. Potenze e Radici n-esime di un Numero Complesso</w:t>
+      </w:r>
+    </w:p>
+    <w:p>
+      <w:r>
+        <w:rPr>
+          <w:b/>
+          <w:color w:val="E97132"/>
+        </w:rPr>
+        <w:t>Le potenze in forma polare</w:t>
+      </w:r>
+    </w:p>
+    <w:p>
+      <w:r>
+        <w:rPr/>
+        <w:t>Il prodotto in forma polare rende banale il calcolo delle potenze. Se z = r e</w:t>
+      </w:r>
+      <w:r>
+        <w:rPr>
+          <w:vertAlign w:val="superscript"/>
+        </w:rPr>
+        <w:t>iθ</w:t>
+      </w:r>
+      <w:r>
+        <w:rPr/>
+        <w:t xml:space="preserve"> e n ≥ 1 è un numero naturale, elevare z alla n significa moltiplicare r per se stesso n volte (si ottiene r</w:t>
+      </w:r>
+      <w:r>
+        <w:rPr>
+          <w:vertAlign w:val="superscript"/>
+        </w:rPr>
+        <w:t>n</w:t>
+      </w:r>
+      <w:r>
+        <w:rPr/>
+        <w:t>) e sommare θ a se stesso n volte (si ottiene nθ):</w:t>
+      </w:r>
+    </w:p>
+    <w:p>
+      <w:r>
+        <w:rPr/>
+        <w:t>z</w:t>
+      </w:r>
+      <w:r>
+        <w:rPr>
+          <w:vertAlign w:val="superscript"/>
+        </w:rPr>
+        <w:t>n</w:t>
+      </w:r>
+      <w:r>
+        <w:rPr/>
+        <w:t xml:space="preserve"> = (r e</w:t>
+      </w:r>
+      <w:r>
+        <w:rPr>
+          <w:vertAlign w:val="superscript"/>
+        </w:rPr>
+        <w:t>iθ</w:t>
+      </w:r>
+      <w:r>
+        <w:rPr/>
+        <w:t>)</w:t>
+      </w:r>
+      <w:r>
+        <w:rPr>
+          <w:vertAlign w:val="superscript"/>
+        </w:rPr>
+        <w:t>n</w:t>
+      </w:r>
+      <w:r>
+        <w:rPr/>
+        <w:t xml:space="preserve"> = r</w:t>
+      </w:r>
+      <w:r>
+        <w:rPr>
+          <w:vertAlign w:val="superscript"/>
+        </w:rPr>
+        <w:t>n</w:t>
+      </w:r>
+      <w:r>
+        <w:rPr/>
+        <w:t xml:space="preserve"> e</w:t>
+      </w:r>
+      <w:r>
+        <w:rPr>
+          <w:vertAlign w:val="superscript"/>
+        </w:rPr>
+        <w:t>inθ</w:t>
+      </w:r>
+      <w:r>
+        <w:rPr/>
+        <w:t xml:space="preserve"> = r</w:t>
+      </w:r>
+      <w:r>
+        <w:rPr>
+          <w:vertAlign w:val="superscript"/>
+        </w:rPr>
+        <w:t>n</w:t>
+      </w:r>
+      <w:r>
+        <w:rPr/>
+        <w:t xml:space="preserve"> (cos nθ + i sen nθ)</w:t>
+      </w:r>
+    </w:p>
+    <w:p>
+      <w:r>
+        <w:rPr/>
+        <w:t xml:space="preserve">Questa è la </w:t>
+      </w:r>
+      <w:r>
+        <w:rPr>
+          <w:b/>
+        </w:rPr>
+        <w:t>formula di De Moivre</w:t>
+      </w:r>
+      <w:r>
+        <w:rPr/>
+        <w:t xml:space="preserve"> (nei testi classici il nome indica il caso r = 1, ma la struttura è la stessa). Ne seguono due regole:</w:t>
+      </w:r>
+    </w:p>
+    <w:p>
+      <w:pPr>
+        <w:numPr>
+          <w:ilvl w:val="0"/>
+          <w:numId w:val="1"/>
+        </w:numPr>
+      </w:pPr>
+      <w:r>
+        <w:rPr/>
+        <w:t>|z</w:t>
+      </w:r>
+      <w:r>
+        <w:rPr>
+          <w:vertAlign w:val="superscript"/>
+        </w:rPr>
+        <w:t>n</w:t>
+      </w:r>
+      <w:r>
+        <w:rPr/>
+        <w:t>| = |z|</w:t>
+      </w:r>
+      <w:r>
+        <w:rPr>
+          <w:vertAlign w:val="superscript"/>
+        </w:rPr>
+        <w:t>n</w:t>
+      </w:r>
+      <w:r>
+        <w:rPr/>
+        <w:t>, cioè il modulo si eleva alla n;</w:t>
+      </w:r>
+    </w:p>
+    <w:p>
+      <w:pPr>
+        <w:numPr>
+          <w:ilvl w:val="0"/>
+          <w:numId w:val="1"/>
+        </w:numPr>
+      </w:pPr>
+      <w:r>
+        <w:rPr/>
+        <w:t>Arg(z</w:t>
+      </w:r>
+      <w:r>
+        <w:rPr>
+          <w:vertAlign w:val="superscript"/>
+        </w:rPr>
+        <w:t>n</w:t>
+      </w:r>
+      <w:r>
+        <w:rPr/>
+        <w:t>) = n · Arg(z), cioè l'argomento si moltiplica per n (come sempre, a meno di multipli di 2π).</w:t>
+      </w:r>
+    </w:p>
+    <w:p>
+      <w:r>
+        <w:rPr>
+          <w:b/>
+        </w:rPr>
+        <w:t>Esempio.</w:t>
+      </w:r>
+      <w:r>
+        <w:rPr/>
+        <w:t xml:space="preserve"> Calcoliamo (1 + i)</w:t>
+      </w:r>
+      <w:r>
+        <w:rPr>
+          <w:vertAlign w:val="superscript"/>
+        </w:rPr>
+        <w:t>2000</w:t>
+      </w:r>
+      <w:r>
+        <w:rPr/>
+        <w:t>, che in forma cartesiana sarebbe impraticabile. Poiché 1 + i = √2 e</w:t>
+      </w:r>
+      <w:r>
+        <w:rPr>
+          <w:vertAlign w:val="superscript"/>
+        </w:rPr>
+        <w:t>iπ/4</w:t>
+      </w:r>
+      <w:r>
+        <w:rPr/>
+        <w:t>:</w:t>
+      </w:r>
+    </w:p>
+    <w:p>
+      <w:r>
+        <w:rPr/>
+        <w:t>(1 + i)</w:t>
+      </w:r>
+      <w:r>
+        <w:rPr>
+          <w:vertAlign w:val="superscript"/>
+        </w:rPr>
+        <w:t>2000</w:t>
+      </w:r>
+      <w:r>
+        <w:rPr/>
+        <w:t xml:space="preserve"> = (√2)</w:t>
+      </w:r>
+      <w:r>
+        <w:rPr>
+          <w:vertAlign w:val="superscript"/>
+        </w:rPr>
+        <w:t>2000</w:t>
+      </w:r>
+      <w:r>
+        <w:rPr/>
+        <w:t xml:space="preserve"> e</w:t>
+      </w:r>
+      <w:r>
+        <w:rPr>
+          <w:vertAlign w:val="superscript"/>
+        </w:rPr>
+        <w:t>i · 2000π/4</w:t>
+      </w:r>
+      <w:r>
+        <w:rPr/>
+        <w:t xml:space="preserve"> = 2</w:t>
+      </w:r>
+      <w:r>
+        <w:rPr>
+          <w:vertAlign w:val="superscript"/>
+        </w:rPr>
+        <w:t>1000</w:t>
+      </w:r>
+      <w:r>
+        <w:rPr/>
+        <w:t xml:space="preserve"> e</w:t>
+      </w:r>
+      <w:r>
+        <w:rPr>
+          <w:vertAlign w:val="superscript"/>
+        </w:rPr>
+        <w:t>i · 500π</w:t>
+      </w:r>
+    </w:p>
+    <w:p>
+      <w:r>
+        <w:rPr/>
+        <w:t>Ora 500π = 250 · 2π è un multiplo intero di 2π, quindi e</w:t>
+      </w:r>
+      <w:r>
+        <w:rPr>
+          <w:vertAlign w:val="superscript"/>
+        </w:rPr>
+        <w:t>i · 500π</w:t>
+      </w:r>
+      <w:r>
+        <w:rPr/>
+        <w:t xml:space="preserve"> = 1 e il risultato è (1 + i)</w:t>
+      </w:r>
+      <w:r>
+        <w:rPr>
+          <w:vertAlign w:val="superscript"/>
+        </w:rPr>
+        <w:t>2000</w:t>
+      </w:r>
+      <w:r>
+        <w:rPr/>
+        <w:t xml:space="preserve"> = 2</w:t>
+      </w:r>
+      <w:r>
+        <w:rPr>
+          <w:vertAlign w:val="superscript"/>
+        </w:rPr>
+        <w:t>1000</w:t>
+      </w:r>
+      <w:r>
+        <w:rPr/>
+        <w:t>.</w:t>
+      </w:r>
+    </w:p>
+    <w:p>
+      <w:r>
+        <w:rPr>
+          <w:b/>
+          <w:color w:val="E97132"/>
+        </w:rPr>
+        <w:t>Le radici n-esime: il problema</w:t>
+      </w:r>
+    </w:p>
+    <w:p>
+      <w:r>
+        <w:rPr/>
+        <w:t>Dato z</w:t>
+      </w:r>
+      <w:r>
+        <w:rPr>
+          <w:vertAlign w:val="subscript"/>
+        </w:rPr>
+        <w:t>0</w:t>
+      </w:r>
+      <w:r>
+        <w:rPr/>
+        <w:t xml:space="preserve"> ∈ ℂ, diciamo che w ∈ ℂ è una </w:t>
+      </w:r>
+      <w:r>
+        <w:rPr>
+          <w:b/>
+        </w:rPr>
+        <w:t>radice n-esima</w:t>
+      </w:r>
+      <w:r>
+        <w:rPr/>
+        <w:t xml:space="preserve"> di z</w:t>
+      </w:r>
+      <w:r>
+        <w:rPr>
+          <w:vertAlign w:val="subscript"/>
+        </w:rPr>
+        <w:t>0</w:t>
+      </w:r>
+      <w:r>
+        <w:rPr/>
+        <w:t xml:space="preserve"> se w</w:t>
+      </w:r>
+      <w:r>
+        <w:rPr>
+          <w:vertAlign w:val="superscript"/>
+        </w:rPr>
+        <w:t>n</w:t>
+      </w:r>
+      <w:r>
+        <w:rPr/>
+        <w:t xml:space="preserve"> = z</w:t>
+      </w:r>
+      <w:r>
+        <w:rPr>
+          <w:vertAlign w:val="subscript"/>
+        </w:rPr>
+        <w:t>0</w:t>
+      </w:r>
+      <w:r>
+        <w:rPr/>
+        <w:t>. Vedremo che, per z</w:t>
+      </w:r>
+      <w:r>
+        <w:rPr>
+          <w:vertAlign w:val="subscript"/>
+        </w:rPr>
+        <w:t>0</w:t>
+      </w:r>
+      <w:r>
+        <w:rPr/>
+        <w:t xml:space="preserve"> ≠ 0, le radici n-esime sono </w:t>
+      </w:r>
+      <w:r>
+        <w:rPr>
+          <w:b/>
+        </w:rPr>
+        <w:t>esattamente n</w:t>
+      </w:r>
+      <w:r>
+        <w:rPr/>
+        <w:t>, tutte distinte. (Per z</w:t>
+      </w:r>
+      <w:r>
+        <w:rPr>
+          <w:vertAlign w:val="subscript"/>
+        </w:rPr>
+        <w:t>0</w:t>
+      </w:r>
+      <w:r>
+        <w:rPr/>
+        <w:t xml:space="preserve"> = 0 l'unica radice è w = 0.)</w:t>
+      </w:r>
+    </w:p>
+    <w:p>
+      <w:r>
+        <w:rPr>
+          <w:b/>
+          <w:color w:val="E97132"/>
+        </w:rPr>
+        <w:t>Come si trovano</w:t>
+      </w:r>
+    </w:p>
+    <w:p>
+      <w:r>
+        <w:rPr/>
+        <w:t>Sia z</w:t>
+      </w:r>
+      <w:r>
+        <w:rPr>
+          <w:vertAlign w:val="subscript"/>
+        </w:rPr>
+        <w:t>0</w:t>
+      </w:r>
+      <w:r>
+        <w:rPr/>
+        <w:t xml:space="preserve"> = r</w:t>
+      </w:r>
+      <w:r>
+        <w:rPr>
+          <w:vertAlign w:val="subscript"/>
+        </w:rPr>
+        <w:t>0</w:t>
+      </w:r>
+      <w:r>
+        <w:rPr/>
+        <w:t xml:space="preserve"> e</w:t>
+      </w:r>
+      <w:r>
+        <w:rPr>
+          <w:vertAlign w:val="superscript"/>
+        </w:rPr>
+        <w:t>iθ_{0</w:t>
+      </w:r>
+      <w:r>
+        <w:rPr/>
+        <w:t>} ≠ 0 e cerchiamo w = r e</w:t>
+      </w:r>
+      <w:r>
+        <w:rPr>
+          <w:vertAlign w:val="superscript"/>
+        </w:rPr>
+        <w:t>iθ</w:t>
+      </w:r>
+      <w:r>
+        <w:rPr/>
+        <w:t xml:space="preserve"> tale che w</w:t>
+      </w:r>
+      <w:r>
+        <w:rPr>
+          <w:vertAlign w:val="superscript"/>
+        </w:rPr>
+        <w:t>n</w:t>
+      </w:r>
+      <w:r>
+        <w:rPr/>
+        <w:t xml:space="preserve"> = z</w:t>
+      </w:r>
+      <w:r>
+        <w:rPr>
+          <w:vertAlign w:val="subscript"/>
+        </w:rPr>
+        <w:t>0</w:t>
+      </w:r>
+      <w:r>
+        <w:rPr/>
+        <w:t>. Per la formula delle potenze l'equazione diventa:</w:t>
+      </w:r>
+    </w:p>
+    <w:p>
+      <w:r>
+        <w:rPr/>
+        <w:t>r</w:t>
+      </w:r>
+      <w:r>
+        <w:rPr>
+          <w:vertAlign w:val="superscript"/>
+        </w:rPr>
+        <w:t>n</w:t>
+      </w:r>
+      <w:r>
+        <w:rPr/>
+        <w:t xml:space="preserve"> e</w:t>
+      </w:r>
+      <w:r>
+        <w:rPr>
+          <w:vertAlign w:val="superscript"/>
+        </w:rPr>
+        <w:t>inθ</w:t>
+      </w:r>
+      <w:r>
+        <w:rPr/>
+        <w:t xml:space="preserve"> = r</w:t>
+      </w:r>
+      <w:r>
+        <w:rPr>
+          <w:vertAlign w:val="subscript"/>
+        </w:rPr>
+        <w:t>0</w:t>
+      </w:r>
+      <w:r>
+        <w:rPr/>
+        <w:t xml:space="preserve"> e</w:t>
+      </w:r>
+      <w:r>
+        <w:rPr>
+          <w:vertAlign w:val="superscript"/>
+        </w:rPr>
+        <w:t>iθ_{0</w:t>
+      </w:r>
+      <w:r>
+        <w:rPr/>
+        <w:t>}</w:t>
+      </w:r>
+    </w:p>
+    <w:p>
+      <w:r>
+        <w:rPr/>
+        <w:t>Per quanto visto nel capitolo 7, due forme polari rappresentano lo stesso numero se e solo se hanno lo stesso modulo e angoli che differiscono per un multiplo di 2π. Si ottengono quindi due condizioni:</w:t>
+      </w:r>
+    </w:p>
+    <w:p>
+      <w:pPr>
+        <w:numPr>
+          <w:ilvl w:val="0"/>
+          <w:numId w:val="1"/>
+        </w:numPr>
+      </w:pPr>
+      <w:r>
+        <w:rPr/>
+        <w:t>sul modulo, r</w:t>
+      </w:r>
+      <w:r>
+        <w:rPr>
+          <w:vertAlign w:val="superscript"/>
+        </w:rPr>
+        <w:t>n</w:t>
+      </w:r>
+      <w:r>
+        <w:rPr/>
+        <w:t xml:space="preserve"> = r</w:t>
+      </w:r>
+      <w:r>
+        <w:rPr>
+          <w:vertAlign w:val="subscript"/>
+        </w:rPr>
+        <w:t>0</w:t>
+      </w:r>
+      <w:r>
+        <w:rPr/>
+        <w:t>, da cui r = ⁿ√r</w:t>
+      </w:r>
+      <w:r>
+        <w:rPr>
+          <w:vertAlign w:val="subscript"/>
+        </w:rPr>
+        <w:t>0</w:t>
+      </w:r>
+      <w:r>
+        <w:rPr/>
+        <w:t>, dove con il simbolo ⁿ√r</w:t>
+      </w:r>
+      <w:r>
+        <w:rPr>
+          <w:vertAlign w:val="subscript"/>
+        </w:rPr>
+        <w:t>0</w:t>
+      </w:r>
+      <w:r>
+        <w:rPr/>
+        <w:t xml:space="preserve"> si intende la radice reale positiva del numero reale positivo r</w:t>
+      </w:r>
+      <w:r>
+        <w:rPr>
+          <w:vertAlign w:val="subscript"/>
+        </w:rPr>
+        <w:t>0</w:t>
+      </w:r>
+      <w:r>
+        <w:rPr/>
+        <w:t>;</w:t>
+      </w:r>
+    </w:p>
+    <w:p>
+      <w:pPr>
+        <w:numPr>
+          <w:ilvl w:val="0"/>
+          <w:numId w:val="1"/>
+        </w:numPr>
+      </w:pPr>
+      <w:r>
+        <w:rPr/>
+        <w:t>sull'angolo, nθ = θ</w:t>
+      </w:r>
+      <w:r>
+        <w:rPr>
+          <w:vertAlign w:val="subscript"/>
+        </w:rPr>
+        <w:t>0</w:t>
+      </w:r>
+      <w:r>
+        <w:rPr/>
+        <w:t xml:space="preserve"> + 2kπ per qualche k ∈ ℤ, da cui θ = θ</w:t>
+      </w:r>
+      <w:r>
+        <w:rPr>
+          <w:vertAlign w:val="subscript"/>
+        </w:rPr>
+        <w:t>0</w:t>
+      </w:r>
+      <w:r>
+        <w:rPr/>
+        <w:t>/n + 2kπ/n.</w:t>
+      </w:r>
+    </w:p>
+    <w:p>
+      <w:r>
+        <w:rPr/>
+        <w:t>Al variare di k gli angoli crescono ogni volta di 2π/n. Le soluzioni distinte sono esattamente quelle con k = 0, 1, …, n − 1, per due motivi:</w:t>
+      </w:r>
+    </w:p>
+    <w:p>
+      <w:pPr>
+        <w:numPr>
+          <w:ilvl w:val="0"/>
+          <w:numId w:val="1"/>
+        </w:numPr>
+      </w:pPr>
+      <w:r>
+        <w:rPr/>
+        <w:t>due indici diversi j ≠ k in {0, …, n − 1} danno angoli che differiscono di 2π(j − k)/n, e poiché 0 &lt; |j − k| &lt; n questa differenza non è un multiplo intero di 2π: i numeri ottenuti sono diversi;</w:t>
+      </w:r>
+    </w:p>
+    <w:p>
+      <w:pPr>
+        <w:numPr>
+          <w:ilvl w:val="0"/>
+          <w:numId w:val="1"/>
+        </w:numPr>
+      </w:pPr>
+      <w:r>
+        <w:rPr/>
+        <w:t>ogni altro intero k si scrive come k = qn + s con 0 ≤ s &lt; n, e l'angolo corrispondente è quello di s più q giri completi: si ritrova quindi la radice con indice s.</w:t>
+      </w:r>
+    </w:p>
+    <w:p>
+      <w:r>
+        <w:rPr/>
+        <w:t>Le radici sono dunque le n soluzioni:</w:t>
+      </w:r>
+    </w:p>
+    <w:p>
+      <w:r>
+        <w:rPr/>
+        <w:t>w</w:t>
+      </w:r>
+      <w:r>
+        <w:rPr>
+          <w:vertAlign w:val="subscript"/>
+        </w:rPr>
+        <w:t>k</w:t>
+      </w:r>
+      <w:r>
+        <w:rPr/>
+        <w:t xml:space="preserve"> = ⁿ√r</w:t>
+      </w:r>
+      <w:r>
+        <w:rPr>
+          <w:vertAlign w:val="subscript"/>
+        </w:rPr>
+        <w:t>0</w:t>
+      </w:r>
+      <w:r>
+        <w:rPr/>
+        <w:t xml:space="preserve"> · e</w:t>
+      </w:r>
+      <w:r>
+        <w:rPr>
+          <w:vertAlign w:val="superscript"/>
+        </w:rPr>
+        <w:t>i(θ_{0</w:t>
+      </w:r>
+      <w:r>
+        <w:rPr/>
+        <w:t>/n + 2kπ/n)}, per k = 0, 1, …, n − 1</w:t>
+      </w:r>
+    </w:p>
+    <w:p>
+      <w:r>
+        <w:rPr>
+          <w:b/>
+        </w:rPr>
+        <w:t>Interpretazione geometrica.</w:t>
+      </w:r>
+      <w:r>
+        <w:rPr/>
+        <w:t xml:space="preserve"> Le n radici hanno tutte lo stesso modulo ⁿ√r</w:t>
+      </w:r>
+      <w:r>
+        <w:rPr>
+          <w:vertAlign w:val="subscript"/>
+        </w:rPr>
+        <w:t>0</w:t>
+      </w:r>
+      <w:r>
+        <w:rPr/>
+        <w:t xml:space="preserve">, quindi stanno su una circonferenza centrata nell'origine, e i loro angoli sono equidistanziati di 2π/n. Sono quindi i </w:t>
+      </w:r>
+      <w:r>
+        <w:rPr>
+          <w:b/>
+        </w:rPr>
+        <w:t>vertici di un poligono regolare</w:t>
+      </w:r>
+      <w:r>
+        <w:rPr/>
+        <w:t xml:space="preserve"> con n lati.</w:t>
+      </w:r>
+    </w:p>
+    <w:p>
+      <w:r>
+        <w:rPr>
+          <w:b/>
+          <w:color w:val="E97132"/>
+        </w:rPr>
+        <w:t>Esempi</w:t>
+      </w:r>
+    </w:p>
+    <w:p>
+      <w:r>
+        <w:rPr>
+          <w:b/>
+        </w:rPr>
+        <w:t>Radici terze di 8.</w:t>
+      </w:r>
+      <w:r>
+        <w:rPr/>
+        <w:t xml:space="preserve"> Qui z</w:t>
+      </w:r>
+      <w:r>
+        <w:rPr>
+          <w:vertAlign w:val="subscript"/>
+        </w:rPr>
+        <w:t>0</w:t>
+      </w:r>
+      <w:r>
+        <w:rPr/>
+        <w:t xml:space="preserve"> = 8 = 8 e</w:t>
+      </w:r>
+      <w:r>
+        <w:rPr>
+          <w:vertAlign w:val="superscript"/>
+        </w:rPr>
+        <w:t>i·0</w:t>
+      </w:r>
+      <w:r>
+        <w:rPr/>
+        <w:t>, quindi r</w:t>
+      </w:r>
+      <w:r>
+        <w:rPr>
+          <w:vertAlign w:val="subscript"/>
+        </w:rPr>
+        <w:t>0</w:t>
+      </w:r>
+      <w:r>
+        <w:rPr/>
+        <w:t xml:space="preserve"> = 8, θ</w:t>
+      </w:r>
+      <w:r>
+        <w:rPr>
+          <w:vertAlign w:val="subscript"/>
+        </w:rPr>
+        <w:t>0</w:t>
+      </w:r>
+      <w:r>
+        <w:rPr/>
+        <w:t xml:space="preserve"> = 0 e n = 3. Il modulo delle radici è ³√8 = 2 e gli angoli sono 2kπ/3:</w:t>
+      </w:r>
+    </w:p>
+    <w:p>
+      <w:pPr>
+        <w:numPr>
+          <w:ilvl w:val="0"/>
+          <w:numId w:val="1"/>
+        </w:numPr>
+      </w:pPr>
+      <w:r>
+        <w:rPr/>
+        <w:t>k = 0: w</w:t>
+      </w:r>
+      <w:r>
+        <w:rPr>
+          <w:vertAlign w:val="subscript"/>
+        </w:rPr>
+        <w:t>0</w:t>
+      </w:r>
+      <w:r>
+        <w:rPr/>
+        <w:t xml:space="preserve"> = 2 e</w:t>
+      </w:r>
+      <w:r>
+        <w:rPr>
+          <w:vertAlign w:val="superscript"/>
+        </w:rPr>
+        <w:t>i·0</w:t>
+      </w:r>
+      <w:r>
+        <w:rPr/>
+        <w:t xml:space="preserve"> = 2;</w:t>
+      </w:r>
+    </w:p>
+    <w:p>
+      <w:pPr>
+        <w:numPr>
+          <w:ilvl w:val="0"/>
+          <w:numId w:val="1"/>
+        </w:numPr>
+      </w:pPr>
+      <w:r>
+        <w:rPr/>
+        <w:t>k = 1: w</w:t>
+      </w:r>
+      <w:r>
+        <w:rPr>
+          <w:vertAlign w:val="subscript"/>
+        </w:rPr>
+        <w:t>1</w:t>
+      </w:r>
+      <w:r>
+        <w:rPr/>
+        <w:t xml:space="preserve"> = 2 e</w:t>
+      </w:r>
+      <w:r>
+        <w:rPr>
+          <w:vertAlign w:val="superscript"/>
+        </w:rPr>
+        <w:t>i2π/3</w:t>
+      </w:r>
+      <w:r>
+        <w:rPr/>
+        <w:t xml:space="preserve"> = 2 (−1/2 + i √3/2) = −1 + i√3;</w:t>
+      </w:r>
+    </w:p>
+    <w:p>
+      <w:pPr>
+        <w:numPr>
+          <w:ilvl w:val="0"/>
+          <w:numId w:val="1"/>
+        </w:numPr>
+      </w:pPr>
+      <w:r>
+        <w:rPr/>
+        <w:t>k = 2: w</w:t>
+      </w:r>
+      <w:r>
+        <w:rPr>
+          <w:vertAlign w:val="subscript"/>
+        </w:rPr>
+        <w:t>2</w:t>
+      </w:r>
+      <w:r>
+        <w:rPr/>
+        <w:t xml:space="preserve"> = 2 e</w:t>
+      </w:r>
+      <w:r>
+        <w:rPr>
+          <w:vertAlign w:val="superscript"/>
+        </w:rPr>
+        <w:t>i4π/3</w:t>
+      </w:r>
+      <w:r>
+        <w:rPr/>
+        <w:t xml:space="preserve"> = 2 (−1/2 − i √3/2) = −1 − i√3.</w:t>
+      </w:r>
+    </w:p>
+    <w:p>
+      <w:r>
+        <w:rPr/>
+        <w:t>Sul piano complesso sono i vertici di un triangolo equilatero inscritto nella circonferenza di raggio 2, con un vertice nel punto (2, 0).</w:t>
+      </w:r>
+    </w:p>
+    <w:p>
+      <w:r>
+        <w:rPr>
+          <w:b/>
+        </w:rPr>
+        <w:t>Soluzioni di z</w:t>
+      </w:r>
+      <w:r>
+        <w:rPr>
+          <w:b/>
+          <w:vertAlign w:val="superscript"/>
+        </w:rPr>
+        <w:t>3</w:t>
+      </w:r>
+      <w:r>
+        <w:rPr>
+          <w:b/>
+        </w:rPr>
+        <w:t xml:space="preserve"> = −8.</w:t>
+      </w:r>
+      <w:r>
+        <w:rPr/>
+        <w:t xml:space="preserve"> Si ha −8 = 8 e</w:t>
+      </w:r>
+      <w:r>
+        <w:rPr>
+          <w:vertAlign w:val="superscript"/>
+        </w:rPr>
+        <w:t>iπ</w:t>
+      </w:r>
+      <w:r>
+        <w:rPr/>
+        <w:t>, quindi r</w:t>
+      </w:r>
+      <w:r>
+        <w:rPr>
+          <w:vertAlign w:val="subscript"/>
+        </w:rPr>
+        <w:t>0</w:t>
+      </w:r>
+      <w:r>
+        <w:rPr/>
+        <w:t xml:space="preserve"> = 8, θ</w:t>
+      </w:r>
+      <w:r>
+        <w:rPr>
+          <w:vertAlign w:val="subscript"/>
+        </w:rPr>
+        <w:t>0</w:t>
+      </w:r>
+      <w:r>
+        <w:rPr/>
+        <w:t xml:space="preserve"> = π e n = 3. Il modulo delle radici è ³√8 = 2 e gli angoli sono π/3 + 2kπ/3, cioè π/3, π e 5π/3. Le tre soluzioni sono:</w:t>
+      </w:r>
+    </w:p>
+    <w:p>
+      <w:pPr>
+        <w:numPr>
+          <w:ilvl w:val="0"/>
+          <w:numId w:val="1"/>
+        </w:numPr>
+      </w:pPr>
+      <w:r>
+        <w:rPr/>
+        <w:t>2 e</w:t>
+      </w:r>
+      <w:r>
+        <w:rPr>
+          <w:vertAlign w:val="superscript"/>
+        </w:rPr>
+        <w:t>iπ/3</w:t>
+      </w:r>
+      <w:r>
+        <w:rPr/>
+        <w:t xml:space="preserve"> = 2 (1/2 + i √3/2) = 1 + i√3;</w:t>
+      </w:r>
+    </w:p>
+    <w:p>
+      <w:pPr>
+        <w:numPr>
+          <w:ilvl w:val="0"/>
+          <w:numId w:val="1"/>
+        </w:numPr>
+      </w:pPr>
+      <w:r>
+        <w:rPr/>
+        <w:t>2 e</w:t>
+      </w:r>
+      <w:r>
+        <w:rPr>
+          <w:vertAlign w:val="superscript"/>
+        </w:rPr>
+        <w:t>iπ</w:t>
+      </w:r>
+      <w:r>
+        <w:rPr/>
+        <w:t xml:space="preserve"> = −2;</w:t>
+      </w:r>
+    </w:p>
+    <w:p>
+      <w:pPr>
+        <w:numPr>
+          <w:ilvl w:val="0"/>
+          <w:numId w:val="1"/>
+        </w:numPr>
+      </w:pPr>
+      <w:r>
+        <w:rPr/>
+        <w:t>2 e</w:t>
+      </w:r>
+      <w:r>
+        <w:rPr>
+          <w:vertAlign w:val="superscript"/>
+        </w:rPr>
+        <w:t>i5π/3</w:t>
+      </w:r>
+      <w:r>
+        <w:rPr/>
+        <w:t xml:space="preserve"> = 2 (1/2 − i √3/2) = 1 − i√3.</w:t>
+      </w:r>
+    </w:p>
+    <w:p>
+      <w:r>
+        <w:rPr>
+          <w:b/>
+        </w:rPr>
+        <w:t>Radici n-esime dell'unità.</w:t>
+      </w:r>
+      <w:r>
+        <w:rPr/>
+        <w:t xml:space="preserve"> L'equazione z</w:t>
+      </w:r>
+      <w:r>
+        <w:rPr>
+          <w:vertAlign w:val="superscript"/>
+        </w:rPr>
+        <w:t>n</w:t>
+      </w:r>
+      <w:r>
+        <w:rPr/>
+        <w:t xml:space="preserve"> = 1 ha come soluzioni z</w:t>
+      </w:r>
+      <w:r>
+        <w:rPr>
+          <w:vertAlign w:val="subscript"/>
+        </w:rPr>
+        <w:t>k</w:t>
+      </w:r>
+      <w:r>
+        <w:rPr/>
+        <w:t xml:space="preserve"> = e</w:t>
+      </w:r>
+      <w:r>
+        <w:rPr>
+          <w:vertAlign w:val="superscript"/>
+        </w:rPr>
+        <w:t>i·2kπ/n</w:t>
+      </w:r>
+      <w:r>
+        <w:rPr/>
+        <w:t xml:space="preserve"> per k = 0, 1, …, n − 1: sono i vertici di un poligono regolare di raggio 1 con n lati, che ha 1 come vertice.</w:t>
+      </w:r>
+    </w:p>
+    <w:p>
+      <w:r>
+        <w:rPr>
+          <w:b/>
+          <w:color w:val="E97132"/>
+        </w:rPr>
+        <w:t>Trabocchetti d'Esame</w:t>
+      </w:r>
+    </w:p>
+    <w:p>
+      <w:pPr>
+        <w:numPr>
+          <w:ilvl w:val="0"/>
+          <w:numId w:val="1"/>
+        </w:numPr>
+      </w:pPr>
+      <w:r>
+        <w:rPr/>
+        <w:t>In ℂ la scrittura "radice n-esima di z" non indica un numero solo, ma l'insieme delle n soluzioni dell'equazione w</w:t>
+      </w:r>
+      <w:r>
+        <w:rPr>
+          <w:vertAlign w:val="superscript"/>
+        </w:rPr>
+        <w:t>n</w:t>
+      </w:r>
+      <w:r>
+        <w:rPr/>
+        <w:t xml:space="preserve"> = z. Quando si risolve un'equazione di questo tipo bisogna sempre elencarle tutte.</w:t>
+      </w:r>
+    </w:p>
+    <w:p>
+      <w:pPr>
+        <w:numPr>
+          <w:ilvl w:val="0"/>
+          <w:numId w:val="1"/>
+        </w:numPr>
+      </w:pPr>
+      <w:r>
+        <w:rPr/>
+        <w:t>Non si può calcolare la radice di un numero complesso "per componenti": in generale ⁿ√(a + bi) è diverso da ⁿ√a + i ⁿ√b. Si passa sempre dalla forma polare.</w:t>
+      </w:r>
+    </w:p>
+    <w:p>
+      <w:pPr>
+        <w:numPr>
+          <w:ilvl w:val="0"/>
+          <w:numId w:val="1"/>
+        </w:numPr>
+      </w:pPr>
+      <w:r>
+        <w:rPr/>
+        <w:t>Ricavando θ da a e b, attenzione al quadrante: quando a &lt; 0 il solo arctan(b/a) dà l'angolo sbagliato (si veda il capitolo 7).</w:t>
+      </w:r>
+    </w:p>
+    <w:p>
+      <w:r>
+        <w:rPr/>
+        <w:t>Le radici e le potenze che abbiamo imparato a calcolare torneranno utili nel prossimo argomento del corso, i polinomi, dove si vedrà quante soluzioni può avere un'equazione algebrica nel campo dei numeri complessi.</w:t>
       </w:r>
     </w:p>
     <w:sectPr>

</xml_diff>

<commit_message>
Algebra: capitoli 7-9 reinseriti con apici/pedici corretti
</commit_message>
<xml_diff>
--- a/Algebra lineare/Riassunto Algebra lineare.docx
+++ b/Algebra lineare/Riassunto Algebra lineare.docx
@@ -3626,11 +3626,11 @@
         <w:rPr>
           <w:vertAlign w:val="superscript"/>
         </w:rPr>
-        <w:t>iθ_{1</w:t>
-      </w:r>
-      <w:r>
-        <w:rPr/>
-        <w:t>} e r</w:t>
+        <w:t>iθ1</w:t>
+      </w:r>
+      <w:r>
+        <w:rPr/>
+        <w:t xml:space="preserve"> e r</w:t>
       </w:r>
       <w:r>
         <w:rPr>
@@ -3646,11 +3646,11 @@
         <w:rPr>
           <w:vertAlign w:val="superscript"/>
         </w:rPr>
-        <w:t>iθ_{2</w:t>
-      </w:r>
-      <w:r>
-        <w:rPr/>
-        <w:t>} rappresentano lo stesso numero complesso se e solo se valgono entrambe le condizioni:</w:t>
+        <w:t>iθ2</w:t>
+      </w:r>
+      <w:r>
+        <w:rPr/>
+        <w:t xml:space="preserve"> rappresentano lo stesso numero complesso se e solo se valgono entrambe le condizioni:</w:t>
       </w:r>
     </w:p>
     <w:p>
@@ -3792,7 +3792,247 @@
         <w:rPr>
           <w:vertAlign w:val="superscript"/>
         </w:rPr>
-        <w:t>i(θ_{1</w:t>
+        <w:t>i(θ1 + θ2)</w:t>
+      </w:r>
+      <w:r>
+        <w:rPr/>
+        <w:t xml:space="preserve"> = e</w:t>
+      </w:r>
+      <w:r>
+        <w:rPr>
+          <w:vertAlign w:val="superscript"/>
+        </w:rPr>
+        <w:t>iθ1</w:t>
+      </w:r>
+      <w:r>
+        <w:rPr/>
+        <w:t xml:space="preserve"> · e</w:t>
+      </w:r>
+      <w:r>
+        <w:rPr>
+          <w:vertAlign w:val="superscript"/>
+        </w:rPr>
+        <w:t>iθ2</w:t>
+      </w:r>
+      <w:r>
+        <w:rPr/>
+        <w:t>.</w:t>
+      </w:r>
+    </w:p>
+    <w:p>
+      <w:r>
+        <w:rPr>
+          <w:i/>
+        </w:rPr>
+        <w:t>Dimostrazione.</w:t>
+      </w:r>
+      <w:r>
+        <w:rPr/>
+        <w:t xml:space="preserve"> Si sviluppa il prodotto applicando la definizione di e</w:t>
+      </w:r>
+      <w:r>
+        <w:rPr>
+          <w:vertAlign w:val="superscript"/>
+        </w:rPr>
+        <w:t>iθ</w:t>
+      </w:r>
+      <w:r>
+        <w:rPr/>
+        <w:t xml:space="preserve"> e la proprietà distributiva, ricordando che i</w:t>
+      </w:r>
+      <w:r>
+        <w:rPr>
+          <w:vertAlign w:val="superscript"/>
+        </w:rPr>
+        <w:t>2</w:t>
+      </w:r>
+      <w:r>
+        <w:rPr/>
+        <w:t xml:space="preserve"> = −1:</w:t>
+      </w:r>
+    </w:p>
+    <w:p>
+      <w:r>
+        <w:rPr/>
+        <w:t>1. e</w:t>
+      </w:r>
+      <w:r>
+        <w:rPr>
+          <w:vertAlign w:val="superscript"/>
+        </w:rPr>
+        <w:t>iθ1</w:t>
+      </w:r>
+      <w:r>
+        <w:rPr/>
+        <w:t xml:space="preserve"> · e</w:t>
+      </w:r>
+      <w:r>
+        <w:rPr>
+          <w:vertAlign w:val="superscript"/>
+        </w:rPr>
+        <w:t>iθ2</w:t>
+      </w:r>
+      <w:r>
+        <w:rPr/>
+        <w:t xml:space="preserve"> = (cos θ</w:t>
+      </w:r>
+      <w:r>
+        <w:rPr>
+          <w:vertAlign w:val="subscript"/>
+        </w:rPr>
+        <w:t>1</w:t>
+      </w:r>
+      <w:r>
+        <w:rPr/>
+        <w:t xml:space="preserve"> + i sen θ</w:t>
+      </w:r>
+      <w:r>
+        <w:rPr>
+          <w:vertAlign w:val="subscript"/>
+        </w:rPr>
+        <w:t>1</w:t>
+      </w:r>
+      <w:r>
+        <w:rPr/>
+        <w:t>) (cos θ</w:t>
+      </w:r>
+      <w:r>
+        <w:rPr>
+          <w:vertAlign w:val="subscript"/>
+        </w:rPr>
+        <w:t>2</w:t>
+      </w:r>
+      <w:r>
+        <w:rPr/>
+        <w:t xml:space="preserve"> + i sen θ</w:t>
+      </w:r>
+      <w:r>
+        <w:rPr>
+          <w:vertAlign w:val="subscript"/>
+        </w:rPr>
+        <w:t>2</w:t>
+      </w:r>
+      <w:r>
+        <w:rPr/>
+        <w:t>), per definizione di e</w:t>
+      </w:r>
+      <w:r>
+        <w:rPr>
+          <w:vertAlign w:val="superscript"/>
+        </w:rPr>
+        <w:t>iθ</w:t>
+      </w:r>
+      <w:r>
+        <w:rPr/>
+        <w:t>;</w:t>
+      </w:r>
+    </w:p>
+    <w:p>
+      <w:r>
+        <w:rPr/>
+        <w:t>2. = (cos θ</w:t>
+      </w:r>
+      <w:r>
+        <w:rPr>
+          <w:vertAlign w:val="subscript"/>
+        </w:rPr>
+        <w:t>1</w:t>
+      </w:r>
+      <w:r>
+        <w:rPr/>
+        <w:t xml:space="preserve"> cos θ</w:t>
+      </w:r>
+      <w:r>
+        <w:rPr>
+          <w:vertAlign w:val="subscript"/>
+        </w:rPr>
+        <w:t>2</w:t>
+      </w:r>
+      <w:r>
+        <w:rPr/>
+        <w:t xml:space="preserve"> − sen θ</w:t>
+      </w:r>
+      <w:r>
+        <w:rPr>
+          <w:vertAlign w:val="subscript"/>
+        </w:rPr>
+        <w:t>1</w:t>
+      </w:r>
+      <w:r>
+        <w:rPr/>
+        <w:t xml:space="preserve"> sen θ</w:t>
+      </w:r>
+      <w:r>
+        <w:rPr>
+          <w:vertAlign w:val="subscript"/>
+        </w:rPr>
+        <w:t>2</w:t>
+      </w:r>
+      <w:r>
+        <w:rPr/>
+        <w:t>) + i (cos θ</w:t>
+      </w:r>
+      <w:r>
+        <w:rPr>
+          <w:vertAlign w:val="subscript"/>
+        </w:rPr>
+        <w:t>1</w:t>
+      </w:r>
+      <w:r>
+        <w:rPr/>
+        <w:t xml:space="preserve"> sen θ</w:t>
+      </w:r>
+      <w:r>
+        <w:rPr>
+          <w:vertAlign w:val="subscript"/>
+        </w:rPr>
+        <w:t>2</w:t>
+      </w:r>
+      <w:r>
+        <w:rPr/>
+        <w:t xml:space="preserve"> + sen θ</w:t>
+      </w:r>
+      <w:r>
+        <w:rPr>
+          <w:vertAlign w:val="subscript"/>
+        </w:rPr>
+        <w:t>1</w:t>
+      </w:r>
+      <w:r>
+        <w:rPr/>
+        <w:t xml:space="preserve"> cos θ</w:t>
+      </w:r>
+      <w:r>
+        <w:rPr>
+          <w:vertAlign w:val="subscript"/>
+        </w:rPr>
+        <w:t>2</w:t>
+      </w:r>
+      <w:r>
+        <w:rPr/>
+        <w:t>), sviluppando il prodotto e usando i</w:t>
+      </w:r>
+      <w:r>
+        <w:rPr>
+          <w:vertAlign w:val="superscript"/>
+        </w:rPr>
+        <w:t>2</w:t>
+      </w:r>
+      <w:r>
+        <w:rPr/>
+        <w:t xml:space="preserve"> = −1;</w:t>
+      </w:r>
+    </w:p>
+    <w:p>
+      <w:r>
+        <w:rPr/>
+        <w:t>3. = cos(θ</w:t>
+      </w:r>
+      <w:r>
+        <w:rPr>
+          <w:vertAlign w:val="subscript"/>
+        </w:rPr>
+        <w:t>1</w:t>
       </w:r>
       <w:r>
         <w:rPr/>
@@ -3806,85 +4046,58 @@
       </w:r>
       <w:r>
         <w:rPr/>
-        <w:t>)} = e</w:t>
-      </w:r>
-      <w:r>
-        <w:rPr>
-          <w:vertAlign w:val="superscript"/>
-        </w:rPr>
-        <w:t>iθ_{1</w:t>
-      </w:r>
-      <w:r>
-        <w:rPr/>
-        <w:t>} · e</w:t>
-      </w:r>
-      <w:r>
-        <w:rPr>
-          <w:vertAlign w:val="superscript"/>
-        </w:rPr>
-        <w:t>iθ_{2</w:t>
-      </w:r>
-      <w:r>
-        <w:rPr/>
-        <w:t>}.</w:t>
-      </w:r>
-    </w:p>
-    <w:p>
-      <w:r>
-        <w:rPr>
-          <w:i/>
-        </w:rPr>
-        <w:t>Dimostrazione.</w:t>
-      </w:r>
-      <w:r>
-        <w:rPr/>
-        <w:t xml:space="preserve"> Si sviluppa il prodotto applicando la definizione di e</w:t>
-      </w:r>
-      <w:r>
-        <w:rPr>
-          <w:vertAlign w:val="superscript"/>
-        </w:rPr>
-        <w:t>iθ</w:t>
-      </w:r>
-      <w:r>
-        <w:rPr/>
-        <w:t xml:space="preserve"> e la proprietà distributiva, ricordando che i</w:t>
-      </w:r>
-      <w:r>
-        <w:rPr>
-          <w:vertAlign w:val="superscript"/>
+        <w:t>) + i sen(θ</w:t>
+      </w:r>
+      <w:r>
+        <w:rPr>
+          <w:vertAlign w:val="subscript"/>
+        </w:rPr>
+        <w:t>1</w:t>
+      </w:r>
+      <w:r>
+        <w:rPr/>
+        <w:t xml:space="preserve"> + θ</w:t>
+      </w:r>
+      <w:r>
+        <w:rPr>
+          <w:vertAlign w:val="subscript"/>
         </w:rPr>
         <w:t>2</w:t>
       </w:r>
       <w:r>
         <w:rPr/>
-        <w:t xml:space="preserve"> = −1:</w:t>
-      </w:r>
-    </w:p>
-    <w:p>
-      <w:r>
-        <w:rPr/>
-        <w:t>1. e</w:t>
-      </w:r>
-      <w:r>
-        <w:rPr>
-          <w:vertAlign w:val="superscript"/>
-        </w:rPr>
-        <w:t>iθ_{1</w:t>
-      </w:r>
-      <w:r>
-        <w:rPr/>
-        <w:t>} · e</w:t>
-      </w:r>
-      <w:r>
-        <w:rPr>
-          <w:vertAlign w:val="superscript"/>
-        </w:rPr>
-        <w:t>iθ_{2</w:t>
-      </w:r>
-      <w:r>
-        <w:rPr/>
-        <w:t>} = (cos θ</w:t>
+        <w:t>), perché le due parentesi sono proprio le formule di addizione di coseno e seno;</w:t>
+      </w:r>
+    </w:p>
+    <w:p>
+      <w:r>
+        <w:rPr/>
+        <w:t>4. = e</w:t>
+      </w:r>
+      <w:r>
+        <w:rPr>
+          <w:vertAlign w:val="superscript"/>
+        </w:rPr>
+        <w:t>i(θ1 + θ2)</w:t>
+      </w:r>
+      <w:r>
+        <w:rPr/>
+        <w:t>, di nuovo per definizione. ∎</w:t>
+      </w:r>
+    </w:p>
+    <w:p>
+      <w:r>
+        <w:rPr>
+          <w:b/>
+          <w:color w:val="E97132"/>
+        </w:rPr>
+        <w:t>Il prodotto: i moduli si moltiplicano, gli angoli si sommano</w:t>
+      </w:r>
+    </w:p>
+    <w:p>
+      <w:r>
+        <w:rPr/>
+        <w:t>Siano z</w:t>
       </w:r>
       <w:r>
         <w:rPr>
@@ -3894,7 +4107,7 @@
       </w:r>
       <w:r>
         <w:rPr/>
-        <w:t xml:space="preserve"> + i sen θ</w:t>
+        <w:t xml:space="preserve"> = r</w:t>
       </w:r>
       <w:r>
         <w:rPr>
@@ -3904,7 +4117,17 @@
       </w:r>
       <w:r>
         <w:rPr/>
-        <w:t>) (cos θ</w:t>
+        <w:t xml:space="preserve"> e</w:t>
+      </w:r>
+      <w:r>
+        <w:rPr>
+          <w:vertAlign w:val="superscript"/>
+        </w:rPr>
+        <w:t>iθ1</w:t>
+      </w:r>
+      <w:r>
+        <w:rPr/>
+        <w:t xml:space="preserve"> e z</w:t>
       </w:r>
       <w:r>
         <w:rPr>
@@ -3914,7 +4137,7 @@
       </w:r>
       <w:r>
         <w:rPr/>
-        <w:t xml:space="preserve"> + i sen θ</w:t>
+        <w:t xml:space="preserve"> = r</w:t>
       </w:r>
       <w:r>
         <w:rPr>
@@ -3924,23 +4147,23 @@
       </w:r>
       <w:r>
         <w:rPr/>
-        <w:t>), per definizione di e</w:t>
-      </w:r>
-      <w:r>
-        <w:rPr>
-          <w:vertAlign w:val="superscript"/>
-        </w:rPr>
-        <w:t>iθ</w:t>
-      </w:r>
-      <w:r>
-        <w:rPr/>
-        <w:t>;</w:t>
-      </w:r>
-    </w:p>
-    <w:p>
-      <w:r>
-        <w:rPr/>
-        <w:t>2. = (cos θ</w:t>
+        <w:t xml:space="preserve"> e</w:t>
+      </w:r>
+      <w:r>
+        <w:rPr>
+          <w:vertAlign w:val="superscript"/>
+        </w:rPr>
+        <w:t>iθ2</w:t>
+      </w:r>
+      <w:r>
+        <w:rPr/>
+        <w:t>. Grazie alla proposizione precedente il prodotto si calcola in una riga:</w:t>
+      </w:r>
+    </w:p>
+    <w:p>
+      <w:r>
+        <w:rPr/>
+        <w:t>z</w:t>
       </w:r>
       <w:r>
         <w:rPr>
@@ -3950,7 +4173,7 @@
       </w:r>
       <w:r>
         <w:rPr/>
-        <w:t xml:space="preserve"> cos θ</w:t>
+        <w:t xml:space="preserve"> z</w:t>
       </w:r>
       <w:r>
         <w:rPr>
@@ -3960,7 +4183,7 @@
       </w:r>
       <w:r>
         <w:rPr/>
-        <w:t xml:space="preserve"> − sen θ</w:t>
+        <w:t xml:space="preserve"> = r</w:t>
       </w:r>
       <w:r>
         <w:rPr>
@@ -3970,7 +4193,17 @@
       </w:r>
       <w:r>
         <w:rPr/>
-        <w:t xml:space="preserve"> sen θ</w:t>
+        <w:t xml:space="preserve"> e</w:t>
+      </w:r>
+      <w:r>
+        <w:rPr>
+          <w:vertAlign w:val="superscript"/>
+        </w:rPr>
+        <w:t>iθ1</w:t>
+      </w:r>
+      <w:r>
+        <w:rPr/>
+        <w:t xml:space="preserve"> · r</w:t>
       </w:r>
       <w:r>
         <w:rPr>
@@ -3980,7 +4213,17 @@
       </w:r>
       <w:r>
         <w:rPr/>
-        <w:t>) + i (cos θ</w:t>
+        <w:t xml:space="preserve"> e</w:t>
+      </w:r>
+      <w:r>
+        <w:rPr>
+          <w:vertAlign w:val="superscript"/>
+        </w:rPr>
+        <w:t>iθ2</w:t>
+      </w:r>
+      <w:r>
+        <w:rPr/>
+        <w:t xml:space="preserve"> = (r</w:t>
       </w:r>
       <w:r>
         <w:rPr>
@@ -3990,7 +4233,7 @@
       </w:r>
       <w:r>
         <w:rPr/>
-        <w:t xml:space="preserve"> sen θ</w:t>
+        <w:t xml:space="preserve"> r</w:t>
       </w:r>
       <w:r>
         <w:rPr>
@@ -4000,290 +4243,13 @@
       </w:r>
       <w:r>
         <w:rPr/>
-        <w:t xml:space="preserve"> + sen θ</w:t>
-      </w:r>
-      <w:r>
-        <w:rPr>
-          <w:vertAlign w:val="subscript"/>
-        </w:rPr>
-        <w:t>1</w:t>
-      </w:r>
-      <w:r>
-        <w:rPr/>
-        <w:t xml:space="preserve"> cos θ</w:t>
-      </w:r>
-      <w:r>
-        <w:rPr>
-          <w:vertAlign w:val="subscript"/>
-        </w:rPr>
-        <w:t>2</w:t>
-      </w:r>
-      <w:r>
-        <w:rPr/>
-        <w:t>), sviluppando il prodotto e usando i</w:t>
-      </w:r>
-      <w:r>
-        <w:rPr>
-          <w:vertAlign w:val="superscript"/>
-        </w:rPr>
-        <w:t>2</w:t>
-      </w:r>
-      <w:r>
-        <w:rPr/>
-        <w:t xml:space="preserve"> = −1;</w:t>
-      </w:r>
-    </w:p>
-    <w:p>
-      <w:r>
-        <w:rPr/>
-        <w:t>3. = cos(θ</w:t>
-      </w:r>
-      <w:r>
-        <w:rPr>
-          <w:vertAlign w:val="subscript"/>
-        </w:rPr>
-        <w:t>1</w:t>
-      </w:r>
-      <w:r>
-        <w:rPr/>
-        <w:t xml:space="preserve"> + θ</w:t>
-      </w:r>
-      <w:r>
-        <w:rPr>
-          <w:vertAlign w:val="subscript"/>
-        </w:rPr>
-        <w:t>2</w:t>
-      </w:r>
-      <w:r>
-        <w:rPr/>
-        <w:t>) + i sen(θ</w:t>
-      </w:r>
-      <w:r>
-        <w:rPr>
-          <w:vertAlign w:val="subscript"/>
-        </w:rPr>
-        <w:t>1</w:t>
-      </w:r>
-      <w:r>
-        <w:rPr/>
-        <w:t xml:space="preserve"> + θ</w:t>
-      </w:r>
-      <w:r>
-        <w:rPr>
-          <w:vertAlign w:val="subscript"/>
-        </w:rPr>
-        <w:t>2</w:t>
-      </w:r>
-      <w:r>
-        <w:rPr/>
-        <w:t>), perché le due parentesi sono proprio le formule di addizione di coseno e seno;</w:t>
-      </w:r>
-    </w:p>
-    <w:p>
-      <w:r>
-        <w:rPr/>
-        <w:t>4. = e</w:t>
-      </w:r>
-      <w:r>
-        <w:rPr>
-          <w:vertAlign w:val="superscript"/>
-        </w:rPr>
-        <w:t>i(θ_{1</w:t>
-      </w:r>
-      <w:r>
-        <w:rPr/>
-        <w:t xml:space="preserve"> + θ</w:t>
-      </w:r>
-      <w:r>
-        <w:rPr>
-          <w:vertAlign w:val="subscript"/>
-        </w:rPr>
-        <w:t>2</w:t>
-      </w:r>
-      <w:r>
-        <w:rPr/>
-        <w:t>)}, di nuovo per definizione. ∎</w:t>
-      </w:r>
-    </w:p>
-    <w:p>
-      <w:r>
-        <w:rPr>
-          <w:b/>
-          <w:color w:val="E97132"/>
-        </w:rPr>
-        <w:t>Il prodotto: i moduli si moltiplicano, gli angoli si sommano</w:t>
-      </w:r>
-    </w:p>
-    <w:p>
-      <w:r>
-        <w:rPr/>
-        <w:t>Siano z</w:t>
-      </w:r>
-      <w:r>
-        <w:rPr>
-          <w:vertAlign w:val="subscript"/>
-        </w:rPr>
-        <w:t>1</w:t>
-      </w:r>
-      <w:r>
-        <w:rPr/>
-        <w:t xml:space="preserve"> = r</w:t>
-      </w:r>
-      <w:r>
-        <w:rPr>
-          <w:vertAlign w:val="subscript"/>
-        </w:rPr>
-        <w:t>1</w:t>
-      </w:r>
-      <w:r>
-        <w:rPr/>
-        <w:t xml:space="preserve"> e</w:t>
-      </w:r>
-      <w:r>
-        <w:rPr>
-          <w:vertAlign w:val="superscript"/>
-        </w:rPr>
-        <w:t>iθ_{1</w:t>
-      </w:r>
-      <w:r>
-        <w:rPr/>
-        <w:t>} e z</w:t>
-      </w:r>
-      <w:r>
-        <w:rPr>
-          <w:vertAlign w:val="subscript"/>
-        </w:rPr>
-        <w:t>2</w:t>
-      </w:r>
-      <w:r>
-        <w:rPr/>
-        <w:t xml:space="preserve"> = r</w:t>
-      </w:r>
-      <w:r>
-        <w:rPr>
-          <w:vertAlign w:val="subscript"/>
-        </w:rPr>
-        <w:t>2</w:t>
-      </w:r>
-      <w:r>
-        <w:rPr/>
-        <w:t xml:space="preserve"> e</w:t>
-      </w:r>
-      <w:r>
-        <w:rPr>
-          <w:vertAlign w:val="superscript"/>
-        </w:rPr>
-        <w:t>iθ_{2</w:t>
-      </w:r>
-      <w:r>
-        <w:rPr/>
-        <w:t>}. Grazie alla proposizione precedente il prodotto si calcola in una riga:</w:t>
-      </w:r>
-    </w:p>
-    <w:p>
-      <w:r>
-        <w:rPr/>
-        <w:t>z</w:t>
-      </w:r>
-      <w:r>
-        <w:rPr>
-          <w:vertAlign w:val="subscript"/>
-        </w:rPr>
-        <w:t>1</w:t>
-      </w:r>
-      <w:r>
-        <w:rPr/>
-        <w:t xml:space="preserve"> z</w:t>
-      </w:r>
-      <w:r>
-        <w:rPr>
-          <w:vertAlign w:val="subscript"/>
-        </w:rPr>
-        <w:t>2</w:t>
-      </w:r>
-      <w:r>
-        <w:rPr/>
-        <w:t xml:space="preserve"> = r</w:t>
-      </w:r>
-      <w:r>
-        <w:rPr>
-          <w:vertAlign w:val="subscript"/>
-        </w:rPr>
-        <w:t>1</w:t>
-      </w:r>
-      <w:r>
-        <w:rPr/>
-        <w:t xml:space="preserve"> e</w:t>
-      </w:r>
-      <w:r>
-        <w:rPr>
-          <w:vertAlign w:val="superscript"/>
-        </w:rPr>
-        <w:t>iθ_{1</w:t>
-      </w:r>
-      <w:r>
-        <w:rPr/>
-        <w:t>} · r</w:t>
-      </w:r>
-      <w:r>
-        <w:rPr>
-          <w:vertAlign w:val="subscript"/>
-        </w:rPr>
-        <w:t>2</w:t>
-      </w:r>
-      <w:r>
-        <w:rPr/>
-        <w:t xml:space="preserve"> e</w:t>
-      </w:r>
-      <w:r>
-        <w:rPr>
-          <w:vertAlign w:val="superscript"/>
-        </w:rPr>
-        <w:t>iθ_{2</w:t>
-      </w:r>
-      <w:r>
-        <w:rPr/>
-        <w:t>} = (r</w:t>
-      </w:r>
-      <w:r>
-        <w:rPr>
-          <w:vertAlign w:val="subscript"/>
-        </w:rPr>
-        <w:t>1</w:t>
-      </w:r>
-      <w:r>
-        <w:rPr/>
-        <w:t xml:space="preserve"> r</w:t>
-      </w:r>
-      <w:r>
-        <w:rPr>
-          <w:vertAlign w:val="subscript"/>
-        </w:rPr>
-        <w:t>2</w:t>
-      </w:r>
-      <w:r>
-        <w:rPr/>
         <w:t>) e</w:t>
       </w:r>
       <w:r>
         <w:rPr>
           <w:vertAlign w:val="superscript"/>
         </w:rPr>
-        <w:t>i(θ_{1</w:t>
-      </w:r>
-      <w:r>
-        <w:rPr/>
-        <w:t xml:space="preserve"> + θ</w:t>
-      </w:r>
-      <w:r>
-        <w:rPr>
-          <w:vertAlign w:val="subscript"/>
-        </w:rPr>
-        <w:t>2</w:t>
-      </w:r>
-      <w:r>
-        <w:rPr/>
-        <w:t>)}</w:t>
+        <w:t>i(θ1 + θ2)</w:t>
       </w:r>
     </w:p>
     <w:p>
@@ -4872,21 +4838,11 @@
         <w:rPr>
           <w:vertAlign w:val="superscript"/>
         </w:rPr>
-        <w:t>i(θ_{1</w:t>
-      </w:r>
-      <w:r>
-        <w:rPr/>
-        <w:t xml:space="preserve"> − θ</w:t>
-      </w:r>
-      <w:r>
-        <w:rPr>
-          <w:vertAlign w:val="subscript"/>
-        </w:rPr>
-        <w:t>2</w:t>
-      </w:r>
-      <w:r>
-        <w:rPr/>
-        <w:t>)}, cioè si dividono i moduli e si sottraggono gli argomenti.</w:t>
+        <w:t>i(θ1 − θ2)</w:t>
+      </w:r>
+      <w:r>
+        <w:rPr/>
+        <w:t>, cioè si dividono i moduli e si sottraggono gli argomenti.</w:t>
       </w:r>
     </w:p>
     <w:p>
@@ -5328,11 +5284,11 @@
         <w:rPr>
           <w:vertAlign w:val="superscript"/>
         </w:rPr>
-        <w:t>iθ_{0</w:t>
-      </w:r>
-      <w:r>
-        <w:rPr/>
-        <w:t>} ≠ 0 e cerchiamo w = r e</w:t>
+        <w:t>iθ0</w:t>
+      </w:r>
+      <w:r>
+        <w:rPr/>
+        <w:t xml:space="preserve"> ≠ 0 e cerchiamo w = r e</w:t>
       </w:r>
       <w:r>
         <w:rPr>
@@ -5404,11 +5360,7 @@
         <w:rPr>
           <w:vertAlign w:val="superscript"/>
         </w:rPr>
-        <w:t>iθ_{0</w:t>
-      </w:r>
-      <w:r>
-        <w:rPr/>
-        <w:t>}</w:t>
+        <w:t>iθ0</w:t>
       </w:r>
     </w:p>
     <w:p>
@@ -5576,11 +5528,11 @@
         <w:rPr>
           <w:vertAlign w:val="superscript"/>
         </w:rPr>
-        <w:t>i(θ_{0</w:t>
-      </w:r>
-      <w:r>
-        <w:rPr/>
-        <w:t>/n + 2kπ/n)}, per k = 0, 1, …, n − 1</w:t>
+        <w:t>i(θ0/n + 2kπ/n)</w:t>
+      </w:r>
+      <w:r>
+        <w:rPr/>
+        <w:t>, per k = 0, 1, …, n − 1</w:t>
       </w:r>
     </w:p>
     <w:p>

</xml_diff>

<commit_message>
Fase 2-3: esami digitalizzati, generatore verificato, flashcard Anki, backup, controlli Word, stili, skill
</commit_message>
<xml_diff>
--- a/Algebra lineare/Riassunto Algebra lineare.docx
+++ b/Algebra lineare/Riassunto Algebra lineare.docx
@@ -4,6 +4,7 @@
   <w:body>
     <w:p>
       <w:pPr>
+        <w:pStyle w:val="Titolo1"/>
         <w:rPr>
           <w:b/>
           <w:bCs/>
@@ -21,6 +22,7 @@
     </w:p>
     <w:p>
       <w:pPr>
+        <w:pStyle w:val="Titolo2"/>
         <w:rPr>
           <w:b/>
           <w:bCs/>
@@ -129,6 +131,7 @@
     </w:p>
     <w:p>
       <w:pPr>
+        <w:pStyle w:val="Titolo2"/>
         <w:rPr>
           <w:b/>
           <w:bCs/>
@@ -202,6 +205,7 @@
     </w:p>
     <w:p>
       <w:pPr>
+        <w:pStyle w:val="Titolo1"/>
         <w:rPr>
           <w:b/>
           <w:bCs/>
@@ -220,6 +224,7 @@
     </w:p>
     <w:p>
       <w:pPr>
+        <w:pStyle w:val="Titolo2"/>
         <w:rPr>
           <w:b/>
           <w:bCs/>
@@ -316,6 +321,7 @@
     </w:p>
     <w:p>
       <w:pPr>
+        <w:pStyle w:val="Titolo2"/>
         <w:rPr>
           <w:b/>
           <w:bCs/>
@@ -419,6 +425,7 @@
     </w:p>
     <w:p>
       <w:pPr>
+        <w:pStyle w:val="Titolo2"/>
         <w:rPr>
           <w:b/>
           <w:bCs/>
@@ -706,6 +713,7 @@
     </w:p>
     <w:p>
       <w:pPr>
+        <w:pStyle w:val="Titolo2"/>
         <w:rPr>
           <w:b/>
           <w:bCs/>
@@ -797,6 +805,7 @@
     </w:p>
     <w:p>
       <w:pPr>
+        <w:pStyle w:val="Titolo2"/>
         <w:rPr>
           <w:b/>
           <w:bCs/>
@@ -840,6 +849,7 @@
     <w:p/>
     <w:p>
       <w:pPr>
+        <w:pStyle w:val="Titolo1"/>
         <w:rPr>
           <w:b/>
           <w:bCs/>
@@ -857,6 +867,7 @@
     </w:p>
     <w:p>
       <w:pPr>
+        <w:pStyle w:val="Titolo2"/>
         <w:rPr>
           <w:b/>
           <w:bCs/>
@@ -938,6 +949,7 @@
     </w:p>
     <w:p>
       <w:pPr>
+        <w:pStyle w:val="Titolo2"/>
         <w:rPr>
           <w:b/>
           <w:bCs/>
@@ -1048,6 +1060,7 @@
     </w:p>
     <w:p>
       <w:pPr>
+        <w:pStyle w:val="Titolo2"/>
         <w:rPr>
           <w:b/>
           <w:bCs/>
@@ -1168,6 +1181,7 @@
     <w:p/>
     <w:p>
       <w:pPr>
+        <w:pStyle w:val="Titolo1"/>
         <w:rPr>
           <w:b/>
           <w:bCs/>
@@ -1185,6 +1199,7 @@
     </w:p>
     <w:p>
       <w:pPr>
+        <w:pStyle w:val="Titolo2"/>
         <w:rPr>
           <w:b/>
           <w:bCs/>
@@ -1834,6 +1849,7 @@
     </w:p>
     <w:p>
       <w:pPr>
+        <w:pStyle w:val="Titolo2"/>
         <w:rPr>
           <w:b/>
           <w:bCs/>
@@ -1977,6 +1993,7 @@
     <w:p/>
     <w:p>
       <w:pPr>
+        <w:pStyle w:val="Titolo1"/>
         <w:rPr>
           <w:b/>
           <w:bCs/>
@@ -1994,6 +2011,7 @@
     </w:p>
     <w:p>
       <w:pPr>
+        <w:pStyle w:val="Titolo2"/>
         <w:rPr>
           <w:b/>
           <w:bCs/>
@@ -2068,6 +2086,7 @@
     </w:p>
     <w:p>
       <w:pPr>
+        <w:pStyle w:val="Titolo2"/>
         <w:rPr>
           <w:b/>
           <w:bCs/>
@@ -2140,6 +2159,7 @@
     </w:p>
     <w:p>
       <w:pPr>
+        <w:pStyle w:val="Titolo2"/>
         <w:rPr>
           <w:b/>
           <w:bCs/>
@@ -2221,6 +2241,7 @@
     </w:p>
     <w:p>
       <w:pPr>
+        <w:pStyle w:val="Titolo2"/>
         <w:rPr>
           <w:b/>
           <w:bCs/>
@@ -2326,6 +2347,7 @@
     </w:p>
     <w:p>
       <w:pPr>
+        <w:pStyle w:val="Titolo2"/>
         <w:rPr>
           <w:b/>
           <w:bCs/>
@@ -2536,6 +2558,7 @@
     </w:p>
     <w:p>
       <w:pPr>
+        <w:pStyle w:val="Titolo2"/>
         <w:rPr>
           <w:b/>
           <w:bCs/>
@@ -2642,6 +2665,7 @@
     <w:p/>
     <w:p>
       <w:pPr>
+        <w:pStyle w:val="Titolo1"/>
         <w:rPr>
           <w:b/>
           <w:bCs/>
@@ -2676,6 +2700,7 @@
     </w:p>
     <w:p>
       <w:pPr>
+        <w:pStyle w:val="Titolo2"/>
         <w:rPr>
           <w:b/>
           <w:bCs/>
@@ -2768,6 +2793,7 @@
     </w:p>
     <w:p>
       <w:pPr>
+        <w:pStyle w:val="Titolo2"/>
         <w:rPr>
           <w:b/>
           <w:bCs/>
@@ -2936,6 +2962,7 @@
     </w:p>
     <w:p>
       <w:pPr>
+        <w:pStyle w:val="Titolo2"/>
         <w:rPr>
           <w:b/>
           <w:bCs/>
@@ -3040,6 +3067,9 @@
       </w:r>
     </w:p>
     <w:p>
+      <w:pPr>
+        <w:pStyle w:val="Titolo1"/>
+      </w:pPr>
       <w:r>
         <w:rPr>
           <w:b/>
@@ -3049,6 +3079,9 @@
       </w:r>
     </w:p>
     <w:p>
+      <w:pPr>
+        <w:pStyle w:val="Titolo2"/>
+      </w:pPr>
       <w:r>
         <w:rPr>
           <w:b/>
@@ -3178,6 +3211,9 @@
       </w:r>
     </w:p>
     <w:p>
+      <w:pPr>
+        <w:pStyle w:val="Titolo2"/>
+      </w:pPr>
       <w:r>
         <w:rPr>
           <w:b/>
@@ -3345,6 +3381,9 @@
       </w:r>
     </w:p>
     <w:p>
+      <w:pPr>
+        <w:pStyle w:val="Titolo2"/>
+      </w:pPr>
       <w:r>
         <w:rPr>
           <w:b/>
@@ -3540,6 +3579,9 @@
       </w:r>
     </w:p>
     <w:p>
+      <w:pPr>
+        <w:pStyle w:val="Titolo2"/>
+      </w:pPr>
       <w:r>
         <w:rPr>
           <w:b/>
@@ -3599,6 +3641,9 @@
       </w:r>
     </w:p>
     <w:p>
+      <w:pPr>
+        <w:pStyle w:val="Titolo2"/>
+      </w:pPr>
       <w:r>
         <w:rPr>
           <w:b/>
@@ -3724,6 +3769,9 @@
       </w:r>
     </w:p>
     <w:p>
+      <w:pPr>
+        <w:pStyle w:val="Titolo1"/>
+      </w:pPr>
       <w:r>
         <w:rPr>
           <w:b/>
@@ -3733,6 +3781,9 @@
       </w:r>
     </w:p>
     <w:p>
+      <w:pPr>
+        <w:pStyle w:val="Titolo2"/>
+      </w:pPr>
       <w:r>
         <w:rPr>
           <w:b/>
@@ -4086,6 +4137,9 @@
       </w:r>
     </w:p>
     <w:p>
+      <w:pPr>
+        <w:pStyle w:val="Titolo2"/>
+      </w:pPr>
       <w:r>
         <w:rPr>
           <w:b/>
@@ -4579,6 +4633,9 @@
       </w:r>
     </w:p>
     <w:p>
+      <w:pPr>
+        <w:pStyle w:val="Titolo2"/>
+      </w:pPr>
       <w:r>
         <w:rPr>
           <w:b/>
@@ -4852,6 +4909,9 @@
       </w:r>
     </w:p>
     <w:p>
+      <w:pPr>
+        <w:pStyle w:val="Titolo1"/>
+      </w:pPr>
       <w:r>
         <w:rPr>
           <w:b/>
@@ -4861,6 +4921,9 @@
       </w:r>
     </w:p>
     <w:p>
+      <w:pPr>
+        <w:pStyle w:val="Titolo2"/>
+      </w:pPr>
       <w:r>
         <w:rPr>
           <w:b/>
@@ -5152,6 +5215,9 @@
       </w:r>
     </w:p>
     <w:p>
+      <w:pPr>
+        <w:pStyle w:val="Titolo2"/>
+      </w:pPr>
       <w:r>
         <w:rPr>
           <w:b/>
@@ -5247,6 +5313,9 @@
       </w:r>
     </w:p>
     <w:p>
+      <w:pPr>
+        <w:pStyle w:val="Titolo2"/>
+      </w:pPr>
       <w:r>
         <w:rPr>
           <w:b/>
@@ -5568,6 +5637,9 @@
       </w:r>
     </w:p>
     <w:p>
+      <w:pPr>
+        <w:pStyle w:val="Titolo2"/>
+      </w:pPr>
       <w:r>
         <w:rPr>
           <w:b/>
@@ -5894,6 +5966,9 @@
       </w:r>
     </w:p>
     <w:p>
+      <w:pPr>
+        <w:pStyle w:val="Titolo2"/>
+      </w:pPr>
       <w:r>
         <w:rPr>
           <w:b/>
@@ -10052,16 +10127,8 @@
     <w:rsid w:val="00484273"/>
     <w:pPr>
       <w:keepNext/>
-      <w:keepLines/>
-      <w:spacing w:before="360" w:after="80"/>
       <w:outlineLvl w:val="0"/>
     </w:pPr>
-    <w:rPr>
-      <w:rFonts w:asciiTheme="majorHAnsi" w:eastAsiaTheme="majorEastAsia" w:hAnsiTheme="majorHAnsi" w:cstheme="majorBidi"/>
-      <w:color w:val="0F4761" w:themeColor="accent1" w:themeShade="BF"/>
-      <w:sz w:val="40"/>
-      <w:szCs w:val="40"/>
-    </w:rPr>
   </w:style>
   <w:style w:type="paragraph" w:styleId="Titolo2">
     <w:name w:val="heading 2"/>
@@ -10075,16 +10142,8 @@
     <w:rsid w:val="00484273"/>
     <w:pPr>
       <w:keepNext/>
-      <w:keepLines/>
-      <w:spacing w:before="160" w:after="80"/>
       <w:outlineLvl w:val="1"/>
     </w:pPr>
-    <w:rPr>
-      <w:rFonts w:asciiTheme="majorHAnsi" w:eastAsiaTheme="majorEastAsia" w:hAnsiTheme="majorHAnsi" w:cstheme="majorBidi"/>
-      <w:color w:val="0F4761" w:themeColor="accent1" w:themeShade="BF"/>
-      <w:sz w:val="32"/>
-      <w:szCs w:val="32"/>
-    </w:rPr>
   </w:style>
   <w:style w:type="paragraph" w:styleId="Titolo3">
     <w:name w:val="heading 3"/>

</xml_diff>

<commit_message>
Audit: 55 correzioni fattuali applicate ai Word (Algebra, Mate discreta, Fondamenti, Programmazione), strumenti di collaudo/stile/frasi docente, COPERTURA e piano
</commit_message>
<xml_diff>
--- a/Algebra lineare/Riassunto Algebra lineare.docx
+++ b/Algebra lineare/Riassunto Algebra lineare.docx
@@ -111,7 +111,7 @@
         <w:t>scalare</w:t>
       </w:r>
       <w:r>
-        <w:t>), che ha l'effetto di allungare, accorciare o invertire la direzione del vettore.</w:t>
+        <w:t>), che ha l'effetto di allungare, accorciare o invertire il verso del vettore.</w:t>
       </w:r>
     </w:p>
     <w:p>
@@ -149,7 +149,7 @@
     </w:p>
     <w:p>
       <w:r>
-        <w:t xml:space="preserve">Sebbene queste definizioni possano sembrare molto astratte, l'algebra lineare costituisce la struttura portante dell'informatica. In qualsiasi programma software, infatti, i dati in ingresso (input) e i risultati prodotti (output) vengono memorizzati e trasmessi come sequenze o stringhe di numeri, comunemente note come </w:t>
+        <w:t xml:space="preserve">Sebbene queste definizioni possano sembrare molto astratte, l'algebra lineare è fondamentale in informatica. In qualsiasi programma software, infatti, i dati in ingresso (input) e i risultati prodotti (output) vengono memorizzati e trasmessi come sequenze o stringhe di numeri, comunemente note come </w:t>
       </w:r>
       <w:r>
         <w:rPr>
@@ -159,7 +159,7 @@
         <w:t>array</w:t>
       </w:r>
       <w:r>
-        <w:t>. Poiché gli array si comportano a tutti gli effetti come vettori, l'insieme di tutti i possibili input o output forma uno spazio vettoriale, e il processo di elaborazione dei dati consiste prevalentemente nell'applicazione di mappe lineari.</w:t>
+        <w:t>. Poiché gli array si comportano a tutti gli effetti come vettori, l'insieme di tutti i possibili input o output forma uno spazio vettoriale, e molte elaborazioni dei dati sono composte da mappe lineari.</w:t>
       </w:r>
     </w:p>
     <w:p>
@@ -182,7 +182,7 @@
         <w:t>Veicoli autonomi e Intelligenza Artificiale</w:t>
       </w:r>
       <w:r>
-        <w:t>: Un'auto a guida autonoma riceve in continuazione dati dai suoi sensori e dalle telecamere. Un'immagine catturata da una telecamera è composta da una griglia di pixel, dove ciascun colore è identificato da una tripla di numeri RGB (rosso, verde, blu); allo stesso modo, la distanza da un ostacolo è un ulteriore valore numerico fornito da un sensore. Tutti questi dati insieme formano un lungo vettore di input che un algoritmo elabora per generare un vettore di output contenente i comandi di guida, come quanto accelerare, frenare o sterzare. Anche nelle reti neurali e nei modelli di IA generativa (come ChatGPT), i parametri o "pesi" appresi dal sistema durante l'addestramento non sono altro che trasformazioni e mappe lineari.</w:t>
+        <w:t>: Un'auto a guida autonoma riceve in continuazione dati dai suoi sensori e dalle telecamere. Un'immagine catturata da una telecamera è composta da una griglia di pixel, dove ciascun colore è identificato da una tripla di numeri RGB (rosso, verde, blu); allo stesso modo, la distanza da un ostacolo è un ulteriore valore numerico fornito da un sensore. Tutti questi dati insieme formano un lungo vettore di input che un algoritmo elabora per generare un vettore di output contenente i comandi di guida, come quanto accelerare, frenare o sterzare. Anche nelle reti neurali e nei modelli di IA generativa (come ChatGPT), i parametri o "pesi" appresi durante l'addestramento sono i coefficienti di mappe lineari, alternate a funzioni non lineari: l'algebra lineare è quindi una componente fondamentale di questi modelli.</w:t>
       </w:r>
     </w:p>
     <w:p>
@@ -200,7 +200,7 @@
         <w:t>Teoria dei segnali e filtraggio del rumore</w:t>
       </w:r>
       <w:r>
-        <w:t>: Un segnale — che sia un'onda audio, una trasmissione elettromagnetica, un elettrocardiogramma (ECG) o un elettroencefalogramma (EEG) — viene descritto matematicamente come una funzione del tempo che ne misura l'ampiezza in ogni istante. Poiché le funzioni si possono sommare tra loro e moltiplicare per un numero, lo spazio dei segnali forma uno spazio vettoriale. Durante la registrazione o la trasmissione, un segnale viene spesso alterato da rumori ambientali o errori di canale. L'operazione necessaria per "ripulire" il segnale e recuperare l'informazione corretta si realizza proprio applicando un'opportuna mappa lineare.</w:t>
+        <w:t>: Un segnale — che sia un'onda audio, una trasmissione elettromagnetica, un elettrocardiogramma (ECG) o un elettroencefalogramma (EEG) — viene descritto matematicamente come una funzione del tempo che ne misura l'ampiezza in ogni istante. Poiché le funzioni si possono sommare tra loro e moltiplicare per un numero, lo spazio dei segnali forma uno spazio vettoriale. Durante la registrazione o la trasmissione, un segnale viene spesso alterato da rumori ambientali o errori di canale. Per "ripulire" il segnale e recuperare l'informazione corretta si usa spesso un'opportuna mappa lineare.</w:t>
       </w:r>
     </w:p>
     <w:p>
@@ -252,7 +252,7 @@
         <w:t>che cos'è un numero</w:t>
       </w:r>
       <w:r>
-        <w:t xml:space="preserve"> e da dove provengono gli oggetti che usiamo per fare i calcoli. La matematica costruisce i sistemi numerici come una catena di insiemi incapsulati l'uno nell'altro (ℕ ⊂ ℤ ⊂ ℚ ⊂ ℝ), dove ciascun passaggio nasce dall'esigenza algebrica di risolvere un problema o un'operatore non consentito nell'insieme precedente.</w:t>
+        <w:t xml:space="preserve"> e da dove provengono gli oggetti che usiamo per fare i calcoli. La matematica costruisce i sistemi numerici come una catena di insiemi incapsulati l'uno nell'altro (ℕ ⊂ ℤ ⊂ ℚ ⊂ ℝ), dove ℤ nasce per poter sottrarre, ℚ per poter dividere e ℝ per colmare i "buchi" dei razionali (completezza); ℂ, come vedremo, per risolvere equazioni prive di soluzioni reali.</w:t>
       </w:r>
     </w:p>
     <w:p>
@@ -339,7 +339,7 @@
     </w:p>
     <w:p>
       <w:r>
-        <w:t>Rappresentando i numeri razionali su una retta, verrebbe da pensare che essi riempiano tutti i punti disponibili. Tuttavia, già nell'antica Grecia con la scuola pitagorica si scoprì che la diagonale di un quadrato di lato 1 ha lunghezza pari a √2. Come dimostrato formalmente per assurdo, √2 non può essere espresso come rapporto tra due interi: esistono quindi dei "buchi" sulla retta numerica che i razionali non riescono a coprire.</w:t>
+        <w:t>Rappresentando i numeri razionali su una retta, verrebbe da pensare che essi riempiano tutti i punti disponibili. Tuttavia, secondo la tradizione, già nell'antica Grecia un membro della scuola pitagorica si accorse che la diagonale di un quadrato di lato 1, lunga √2, non è commensurabile con il lato. Come dimostrato formalmente per assurdo, √2 non può essere espresso come rapporto tra due interi: esistono quindi dei "buchi" sulla retta numerica che i razionali non riescono a coprire.</w:t>
       </w:r>
     </w:p>
     <w:p>
@@ -687,11 +687,9 @@
           <w:b/>
           <w:bCs/>
         </w:rPr>
-        <w:t>Proprietà di Anello/Legame</w:t>
-      </w:r>
-      <w:r>
-        <w:t>:</w:t>
-      </w:r>
+        <w:t>Proprietà distributiva (lega somma e prodotto):</w:t>
+      </w:r>
+      <w:r/>
     </w:p>
     <w:p>
       <w:pPr>
@@ -764,7 +762,7 @@
         <w:t>ℕ NON è un campo</w:t>
       </w:r>
       <w:r>
-        <w:t>: mancano sia gli opposti (proprietà 4) sia gli inversi.</w:t>
+        <w:t>: mancano sia gli opposti sia gli inversi.</w:t>
       </w:r>
     </w:p>
     <w:p>
@@ -843,7 +841,7 @@
         <w:t>scalari</w:t>
       </w:r>
       <w:r>
-        <w:t>. Nel corso dell'anno, il campo degli scalari di riferimento sarà quasi sempre ℝ (o ℂ per la parte sui numeri complessi).</w:t>
+        <w:t>. Nel corso dell'anno, il campo degli scalari di riferimento sarà generalmente ℝ oppure ℂ (la definizione vale però per qualsiasi campo).</w:t>
       </w:r>
     </w:p>
     <w:p/>
@@ -885,7 +883,7 @@
     </w:p>
     <w:p>
       <w:r>
-        <w:t>Nel percorso di costruzione dei sistemi numerici (ℕ ⊂ ℤ ⊂ ℚ ⊂ ℝ ⊂ ℂ), ogni ampliamento nasce dall'esigenza algebrica di risolvere problemi ed equazioni che non trovano soluzione nell'insieme precedente. Così come l'introduzione dei numeri reali ℝ ha consentito di risolvere equazioni come x</w:t>
+        <w:t>Nel percorso di costruzione dei sistemi numerici (ℕ ⊂ ℤ ⊂ ℚ ⊂ ℝ ⊂ ℂ), ogni ampliamento nasce da un'esigenza precisa: sottrarre (ℤ), dividere (ℚ), colmare i "buchi" dei razionali (ℝ), risolvere equazioni prive di soluzioni reali (ℂ). Così come l'introduzione dei numeri reali ℝ ha consentito di risolvere equazioni come x</w:t>
       </w:r>
       <w:r>
         <w:rPr>
@@ -1002,7 +1000,7 @@
         </w:numPr>
       </w:pPr>
       <w:r>
-        <w:t>a e b sono due numeri reali arbitrari (a, b ∈ ℝ), chiamati rispettivamente parte reale e coefficiente della parte immaginaria.</w:t>
+        <w:t>a e b sono due numeri reali arbitrari (a, b ∈ ℝ), chiamati rispettivamente parte reale (a = Re(z)) e parte immaginaria (b = Im(z)): la parte immaginaria è il numero reale b, non bi.</w:t>
       </w:r>
     </w:p>
     <w:p>
@@ -1951,7 +1949,7 @@
         <w:t>2</w:t>
       </w:r>
       <w:r>
-        <w:t xml:space="preserve"> o chiedere se un numero complesso sia "positivo" o "negativo". Gli unici confronti ammessi tra numeri complessi riguardano la loro eventuale uguaglianza (z</w:t>
+        <w:t xml:space="preserve"> o chiedere se un numero complesso sia "positivo" o "negativo". I numeri complessi come tali si possono solo confrontare per uguaglianza (z</w:t>
       </w:r>
       <w:r>
         <w:rPr>
@@ -1988,6 +1986,9 @@
       </w:r>
       <w:r>
         <w:t>).</w:t>
+      </w:r>
+      <w:r>
+        <w:t xml:space="preserve"> Si possono invece ordinare grandezze reali associate, come i moduli (|z1| &lt; |z2|) o le parti reali (Re(z1) &lt; Re(z2)).</w:t>
       </w:r>
     </w:p>
     <w:p/>
@@ -2788,7 +2789,7 @@
         <w:t>Asse delle ordinate (Asse Immaginario Im)</w:t>
       </w:r>
       <w:r>
-        <w:t>: ospita i numeri immaginari puri, corrispondenti ai complessi con parte reale nulla (0 + bi).</w:t>
+        <w:t>: ospita i numeri della forma bi con b ∈ ℝ (immaginari puri per b ≠ 0, più l'origine).</w:t>
       </w:r>
     </w:p>
     <w:p>

</xml_diff>